<commit_message>
Paper version 24 06 2026
</commit_message>
<xml_diff>
--- a/Proyecto Interno/review-food-security-paper/v16062026-draft-resultados.docx
+++ b/Proyecto Interno/review-food-security-paper/v16062026-draft-resultados.docx
@@ -1317,8 +1317,6 @@
           <w:lang w:val="en-US"/>
         </w:rPr>
       </w:pPr>
-      <w:bookmarkStart w:id="0" w:name="_GoBack"/>
-      <w:bookmarkEnd w:id="0"/>
     </w:p>
     <w:p>
       <w:pPr>
@@ -1335,6 +1333,7 @@
           <w:szCs w:val="28"/>
         </w:rPr>
       </w:pPr>
+      <w:bookmarkStart w:id="0" w:name="_Hlk233020823"/>
       <w:r>
         <w:rPr>
           <w:rFonts w:ascii="Garamond" w:hAnsi="Garamond" w:cs="Tahoma"/>
@@ -1374,261 +1373,456 @@
         <w:t xml:space="preserve"> y la composición de las dietas</w:t>
       </w:r>
     </w:p>
-    <w:p>
-      <w:pPr>
-        <w:jc w:val="both"/>
-        <w:rPr>
-          <w:rFonts w:ascii="Garamond" w:hAnsi="Garamond" w:cs="Tahoma"/>
-          <w:sz w:val="24"/>
-          <w:szCs w:val="24"/>
-        </w:rPr>
-      </w:pPr>
-      <w:r>
-        <w:rPr>
-          <w:rFonts w:ascii="Garamond" w:hAnsi="Garamond" w:cs="Tahoma"/>
-          <w:sz w:val="24"/>
-          <w:szCs w:val="24"/>
-        </w:rPr>
-        <w:t xml:space="preserve">La Figura 2 y la Tabla 1B presentan las tres primas de calidad nutricional que cuantifican el sobrecosto relativo de cada nivel de calidad dietética respecto al inmediatamente inferior. La prima </w:t>
-      </w:r>
-      <w:proofErr w:type="spellStart"/>
-      <w:r>
-        <w:rPr>
-          <w:rFonts w:ascii="Garamond" w:hAnsi="Garamond" w:cs="Tahoma"/>
-          <w:sz w:val="24"/>
-          <w:szCs w:val="24"/>
+    <w:bookmarkEnd w:id="0"/>
+    <w:p>
+      <w:pPr>
+        <w:jc w:val="both"/>
+        <w:rPr>
+          <w:lang w:val="en-US"/>
+        </w:rPr>
+      </w:pPr>
+      <w:r>
+        <w:rPr>
+          <w:lang w:val="en-US"/>
+        </w:rPr>
+        <w:t>Figure~\ref{</w:t>
+      </w:r>
+      <w:proofErr w:type="spellStart"/>
+      <w:proofErr w:type="gramStart"/>
+      <w:r>
+        <w:rPr>
+          <w:lang w:val="en-US"/>
+        </w:rPr>
+        <w:t>fig:quality</w:t>
+      </w:r>
+      <w:proofErr w:type="gramEnd"/>
+      <w:r>
+        <w:rPr>
+          <w:lang w:val="en-US"/>
+        </w:rPr>
+        <w:t>_premium</w:t>
+      </w:r>
+      <w:proofErr w:type="spellEnd"/>
+      <w:r>
+        <w:rPr>
+          <w:lang w:val="en-US"/>
+        </w:rPr>
+        <w:t>} presents the three nutritional quality premiums (</w:t>
+      </w:r>
+      <w:proofErr w:type="spellStart"/>
+      <w:r>
+        <w:rPr>
+          <w:lang w:val="en-US"/>
         </w:rPr>
         <w:t>CoNA</w:t>
       </w:r>
       <w:proofErr w:type="spellEnd"/>
       <w:r>
         <w:rPr>
-          <w:rFonts w:ascii="Garamond" w:hAnsi="Garamond" w:cs="Tahoma"/>
-          <w:sz w:val="24"/>
-          <w:szCs w:val="24"/>
+          <w:lang w:val="en-US"/>
         </w:rPr>
         <w:t>/</w:t>
       </w:r>
       <w:proofErr w:type="spellStart"/>
       <w:r>
         <w:rPr>
-          <w:rFonts w:ascii="Garamond" w:hAnsi="Garamond" w:cs="Tahoma"/>
-          <w:sz w:val="24"/>
-          <w:szCs w:val="24"/>
+          <w:lang w:val="en-US"/>
         </w:rPr>
         <w:t>CoCA</w:t>
       </w:r>
       <w:proofErr w:type="spellEnd"/>
       <w:r>
         <w:rPr>
-          <w:rFonts w:ascii="Garamond" w:hAnsi="Garamond" w:cs="Tahoma"/>
-          <w:sz w:val="24"/>
-          <w:szCs w:val="24"/>
-        </w:rPr>
-        <w:t xml:space="preserve"> ascendió en promedio a 1,92× en Bogotá, 2,07× en Cali y 2,06× en Medellín durante el período completo, lo que indica que una dieta nutricionalmente adecuada costó entre 92% y 107% más que una dieta calóricamente suficiente. La prima </w:t>
-      </w:r>
-      <w:proofErr w:type="spellStart"/>
-      <w:r>
-        <w:rPr>
-          <w:rFonts w:ascii="Garamond" w:hAnsi="Garamond" w:cs="Tahoma"/>
-          <w:sz w:val="24"/>
-          <w:szCs w:val="24"/>
+          <w:lang w:val="en-US"/>
+        </w:rPr>
+        <w:t xml:space="preserve">, </w:t>
+      </w:r>
+      <w:proofErr w:type="spellStart"/>
+      <w:r>
+        <w:rPr>
+          <w:lang w:val="en-US"/>
         </w:rPr>
         <w:t>CoRD</w:t>
       </w:r>
       <w:proofErr w:type="spellEnd"/>
       <w:r>
         <w:rPr>
-          <w:rFonts w:ascii="Garamond" w:hAnsi="Garamond" w:cs="Tahoma"/>
-          <w:sz w:val="24"/>
-          <w:szCs w:val="24"/>
+          <w:lang w:val="en-US"/>
         </w:rPr>
         <w:t>/</w:t>
       </w:r>
       <w:proofErr w:type="spellStart"/>
       <w:r>
         <w:rPr>
-          <w:rFonts w:ascii="Garamond" w:hAnsi="Garamond" w:cs="Tahoma"/>
-          <w:sz w:val="24"/>
-          <w:szCs w:val="24"/>
+          <w:lang w:val="en-US"/>
         </w:rPr>
         <w:t>CoCA</w:t>
       </w:r>
       <w:proofErr w:type="spellEnd"/>
       <w:r>
         <w:rPr>
-          <w:rFonts w:ascii="Garamond" w:hAnsi="Garamond" w:cs="Tahoma"/>
-          <w:sz w:val="24"/>
-          <w:szCs w:val="24"/>
-        </w:rPr>
-        <w:t xml:space="preserve"> fue considerablemente mayor (2,92×–2,97×), mientras que la prima </w:t>
-      </w:r>
-      <w:proofErr w:type="spellStart"/>
-      <w:r>
-        <w:rPr>
-          <w:rFonts w:ascii="Garamond" w:hAnsi="Garamond" w:cs="Tahoma"/>
-          <w:sz w:val="24"/>
-          <w:szCs w:val="24"/>
+          <w:lang w:val="en-US"/>
+        </w:rPr>
+        <w:t xml:space="preserve">, and </w:t>
+      </w:r>
+      <w:proofErr w:type="spellStart"/>
+      <w:r>
+        <w:rPr>
+          <w:lang w:val="en-US"/>
         </w:rPr>
         <w:t>CoRD</w:t>
       </w:r>
       <w:proofErr w:type="spellEnd"/>
       <w:r>
         <w:rPr>
-          <w:rFonts w:ascii="Garamond" w:hAnsi="Garamond" w:cs="Tahoma"/>
-          <w:sz w:val="24"/>
-          <w:szCs w:val="24"/>
+          <w:lang w:val="en-US"/>
         </w:rPr>
         <w:t>/</w:t>
       </w:r>
       <w:proofErr w:type="spellStart"/>
       <w:r>
         <w:rPr>
-          <w:rFonts w:ascii="Garamond" w:hAnsi="Garamond" w:cs="Tahoma"/>
-          <w:sz w:val="24"/>
-          <w:szCs w:val="24"/>
+          <w:lang w:val="en-US"/>
         </w:rPr>
         <w:t>CoNA</w:t>
       </w:r>
       <w:proofErr w:type="spellEnd"/>
       <w:r>
         <w:rPr>
-          <w:rFonts w:ascii="Garamond" w:hAnsi="Garamond" w:cs="Tahoma"/>
-          <w:sz w:val="24"/>
-          <w:szCs w:val="24"/>
-        </w:rPr>
-        <w:t xml:space="preserve"> resultó más contenida: 1,52× en Bogotá, 1,43× en Cali y 1,42× en Medellín, lo que indica que una vez satisfechos los requerimientos nutricionales mínimos, incorporar la diversidad alimentaria recomendada por las GABAS supone un sobrecosto adicional de entre 42% y 52%.</w:t>
-      </w:r>
-    </w:p>
-    <w:p>
-      <w:pPr>
-        <w:jc w:val="both"/>
-        <w:rPr>
-          <w:rFonts w:ascii="Garamond" w:hAnsi="Garamond" w:cs="Tahoma"/>
-          <w:sz w:val="24"/>
-          <w:szCs w:val="24"/>
-        </w:rPr>
-      </w:pPr>
-      <w:r>
-        <w:rPr>
-          <w:rFonts w:ascii="Garamond" w:hAnsi="Garamond" w:cs="Tahoma"/>
-          <w:sz w:val="24"/>
-          <w:szCs w:val="24"/>
-        </w:rPr>
-        <w:t xml:space="preserve">El comportamiento temporal de las primas revela un patrón de aceleración concentrada en 2024 que contrasta con una evolución gradual entre 2019 y 2023. La prima </w:t>
-      </w:r>
-      <w:proofErr w:type="spellStart"/>
-      <w:r>
-        <w:rPr>
-          <w:rFonts w:ascii="Garamond" w:hAnsi="Garamond" w:cs="Tahoma"/>
-          <w:sz w:val="24"/>
-          <w:szCs w:val="24"/>
+          <w:lang w:val="en-US"/>
+        </w:rPr>
+        <w:t xml:space="preserve">), which quantify the relative cost penalty of each dietary quality level. Over the full period, the </w:t>
+      </w:r>
+      <w:proofErr w:type="spellStart"/>
+      <w:r>
+        <w:rPr>
+          <w:lang w:val="en-US"/>
         </w:rPr>
         <w:t>CoNA</w:t>
       </w:r>
       <w:proofErr w:type="spellEnd"/>
       <w:r>
         <w:rPr>
-          <w:rFonts w:ascii="Garamond" w:hAnsi="Garamond" w:cs="Tahoma"/>
-          <w:sz w:val="24"/>
-          <w:szCs w:val="24"/>
+          <w:lang w:val="en-US"/>
         </w:rPr>
         <w:t>/</w:t>
       </w:r>
       <w:proofErr w:type="spellStart"/>
       <w:r>
         <w:rPr>
-          <w:rFonts w:ascii="Garamond" w:hAnsi="Garamond" w:cs="Tahoma"/>
-          <w:sz w:val="24"/>
-          <w:szCs w:val="24"/>
+          <w:lang w:val="en-US"/>
         </w:rPr>
         <w:t>CoCA</w:t>
       </w:r>
       <w:proofErr w:type="spellEnd"/>
       <w:r>
         <w:rPr>
-          <w:rFonts w:ascii="Garamond" w:hAnsi="Garamond" w:cs="Tahoma"/>
-          <w:sz w:val="24"/>
-          <w:szCs w:val="24"/>
-        </w:rPr>
-        <w:t xml:space="preserve">, que en 2019 era de 1,72×–1,85× según la ciudad, se mantuvo en un rango acotado durante el episodio inflacionario de 2021–2023 para experimentar un salto pronunciado en 2024: 2,33× en Bogotá, 2,40× en Medellín y 2,55× en Cali. Este incremento, paradójicamente posterior al pico inflacionario, no refleja un encarecimiento de la dieta nutricionalmente adecuada sino el abaratamiento real del </w:t>
-      </w:r>
-      <w:proofErr w:type="spellStart"/>
-      <w:r>
-        <w:rPr>
-          <w:rFonts w:ascii="Garamond" w:hAnsi="Garamond" w:cs="Tahoma"/>
-          <w:sz w:val="24"/>
-          <w:szCs w:val="24"/>
+          <w:lang w:val="en-US"/>
+        </w:rPr>
+        <w:t xml:space="preserve"> premium reached a median of 1.85 in Bogotá (IQR: 1.80--1.97), 2.01 in Medellín (1.96--2.11), and 1.99 in Cali (1.91--2.14). A nutritionally adequate diet therefore cost between 80% and 114% more than an energy-sufficient diet, depending on the city. The </w:t>
+      </w:r>
+      <w:proofErr w:type="spellStart"/>
+      <w:r>
+        <w:rPr>
+          <w:lang w:val="en-US"/>
+        </w:rPr>
+        <w:t>CoRD</w:t>
+      </w:r>
+      <w:proofErr w:type="spellEnd"/>
+      <w:r>
+        <w:rPr>
+          <w:lang w:val="en-US"/>
+        </w:rPr>
+        <w:t>/</w:t>
+      </w:r>
+      <w:proofErr w:type="spellStart"/>
+      <w:r>
+        <w:rPr>
+          <w:lang w:val="en-US"/>
         </w:rPr>
         <w:t>CoCA</w:t>
       </w:r>
       <w:proofErr w:type="spellEnd"/>
       <w:r>
         <w:rPr>
-          <w:rFonts w:ascii="Garamond" w:hAnsi="Garamond" w:cs="Tahoma"/>
-          <w:sz w:val="24"/>
-          <w:szCs w:val="24"/>
-        </w:rPr>
-        <w:t xml:space="preserve"> documentado en la subsección anterior — los alimentos feculentos de bajo costo cayeron significativamente en términos reales durante 2024, ampliando mecánicamente </w:t>
-      </w:r>
-      <w:proofErr w:type="gramStart"/>
-      <w:r>
-        <w:rPr>
-          <w:rFonts w:ascii="Garamond" w:hAnsi="Garamond" w:cs="Tahoma"/>
-          <w:sz w:val="24"/>
-          <w:szCs w:val="24"/>
-        </w:rPr>
-        <w:t>el ratio</w:t>
-      </w:r>
-      <w:proofErr w:type="gramEnd"/>
-      <w:r>
-        <w:rPr>
-          <w:rFonts w:ascii="Garamond" w:hAnsi="Garamond" w:cs="Tahoma"/>
-          <w:sz w:val="24"/>
-          <w:szCs w:val="24"/>
-        </w:rPr>
-        <w:t xml:space="preserve"> entre ambos indicadores. La prima </w:t>
-      </w:r>
-      <w:proofErr w:type="spellStart"/>
-      <w:r>
-        <w:rPr>
-          <w:rFonts w:ascii="Garamond" w:hAnsi="Garamond" w:cs="Tahoma"/>
-          <w:sz w:val="24"/>
-          <w:szCs w:val="24"/>
+          <w:lang w:val="en-US"/>
+        </w:rPr>
+        <w:t xml:space="preserve"> premium is considerably higher, with medians ranging from 2.80 to 2.84 (IQR: 2.74--3.08). The </w:t>
+      </w:r>
+      <w:proofErr w:type="spellStart"/>
+      <w:r>
+        <w:rPr>
+          <w:lang w:val="en-US"/>
         </w:rPr>
         <w:t>CoRD</w:t>
       </w:r>
       <w:proofErr w:type="spellEnd"/>
       <w:r>
         <w:rPr>
-          <w:rFonts w:ascii="Garamond" w:hAnsi="Garamond" w:cs="Tahoma"/>
-          <w:sz w:val="24"/>
-          <w:szCs w:val="24"/>
+          <w:lang w:val="en-US"/>
         </w:rPr>
         <w:t>/</w:t>
       </w:r>
       <w:proofErr w:type="spellStart"/>
       <w:r>
         <w:rPr>
-          <w:rFonts w:ascii="Garamond" w:hAnsi="Garamond" w:cs="Tahoma"/>
-          <w:sz w:val="24"/>
-          <w:szCs w:val="24"/>
+          <w:lang w:val="en-US"/>
         </w:rPr>
         <w:t>CoNA</w:t>
       </w:r>
       <w:proofErr w:type="spellEnd"/>
       <w:r>
         <w:rPr>
-          <w:rFonts w:ascii="Garamond" w:hAnsi="Garamond" w:cs="Tahoma"/>
-          <w:sz w:val="24"/>
-          <w:szCs w:val="24"/>
-        </w:rPr>
-        <w:t xml:space="preserve"> exhibió en contraste una notable estabilidad a lo largo de todo el período, oscilando entre 1,38× y 1,58× sin tendencia temporal clara, lo que sugiere que el costo marginal de la diversidad dietética por encima de la adecuación nutricional es estable e independiente del ciclo inflacionario.</w:t>
-      </w:r>
-    </w:p>
-    <w:p>
-      <w:pPr>
-        <w:jc w:val="both"/>
+          <w:lang w:val="en-US"/>
+        </w:rPr>
+        <w:t xml:space="preserve"> premium, by contrast, is far more modest: 1.52 in Bogotá (IQR: 1.51--1.54), 1.42 in Medellín (1.40--1.43), and 1.43 in Cali (1.41--1.46). It follows that, once minimum nutritional requirements are met, achieving the dietary diversity recommended by the FBDGs carries a further premium of 40% to 54%.</w:t>
+      </w:r>
+    </w:p>
+    <w:p>
+      <w:pPr>
+        <w:jc w:val="both"/>
+        <w:rPr>
+          <w:lang w:val="en-US"/>
+        </w:rPr>
+      </w:pPr>
+      <w:r>
+        <w:rPr>
+          <w:lang w:val="en-US"/>
+        </w:rPr>
+        <w:t xml:space="preserve">The </w:t>
+      </w:r>
+      <w:proofErr w:type="spellStart"/>
+      <w:r>
+        <w:rPr>
+          <w:lang w:val="en-US"/>
+        </w:rPr>
+        <w:t>CoRD</w:t>
+      </w:r>
+      <w:proofErr w:type="spellEnd"/>
+      <w:r>
+        <w:rPr>
+          <w:lang w:val="en-US"/>
+        </w:rPr>
+        <w:t>/</w:t>
+      </w:r>
+      <w:proofErr w:type="spellStart"/>
+      <w:r>
+        <w:rPr>
+          <w:lang w:val="en-US"/>
+        </w:rPr>
+        <w:t>CoNA</w:t>
+      </w:r>
+      <w:proofErr w:type="spellEnd"/>
+      <w:r>
+        <w:rPr>
+          <w:lang w:val="en-US"/>
+        </w:rPr>
+        <w:t xml:space="preserve"> premium tells a different story. Stable throughout the period, with medians ranging from 1.40 to 1.54 and no discernible temporal trend, it points to a marginal cost of dietary diversity beyond nutritional adequacy that remains steady and unaffected by the inflationary cycle.</w:t>
+      </w:r>
+    </w:p>
+    <w:p>
+      <w:pPr>
+        <w:jc w:val="both"/>
+        <w:rPr>
+          <w:lang w:val="en-US"/>
+        </w:rPr>
+      </w:pPr>
+    </w:p>
+    <w:p>
+      <w:pPr>
+        <w:jc w:val="both"/>
+        <w:rPr>
+          <w:lang w:val="en-US"/>
+        </w:rPr>
+      </w:pPr>
+    </w:p>
+    <w:p>
+      <w:pPr>
+        <w:jc w:val="both"/>
+        <w:rPr>
+          <w:lang w:val="en-US"/>
+        </w:rPr>
+      </w:pPr>
+    </w:p>
+    <w:p>
+      <w:pPr>
+        <w:jc w:val="both"/>
+        <w:rPr>
+          <w:lang w:val="en-US"/>
+        </w:rPr>
+      </w:pPr>
+    </w:p>
+    <w:p>
+      <w:pPr>
+        <w:jc w:val="both"/>
+        <w:rPr>
+          <w:lang w:val="en-US"/>
+        </w:rPr>
+      </w:pPr>
+    </w:p>
+    <w:p>
+      <w:pPr>
+        <w:jc w:val="both"/>
+        <w:rPr>
+          <w:lang w:val="en-US"/>
+        </w:rPr>
+      </w:pPr>
+    </w:p>
+    <w:p>
+      <w:pPr>
+        <w:jc w:val="both"/>
+        <w:rPr>
+          <w:lang w:val="en-US"/>
+        </w:rPr>
+      </w:pPr>
+    </w:p>
+    <w:p>
+      <w:pPr>
+        <w:jc w:val="both"/>
+        <w:rPr>
+          <w:lang w:val="en-US"/>
+        </w:rPr>
+      </w:pPr>
+    </w:p>
+    <w:p>
+      <w:pPr>
+        <w:jc w:val="both"/>
+        <w:rPr>
+          <w:lang w:val="en-US"/>
+        </w:rPr>
+      </w:pPr>
+    </w:p>
+    <w:p>
+      <w:pPr>
+        <w:jc w:val="both"/>
+        <w:rPr>
+          <w:lang w:val="en-US"/>
+        </w:rPr>
+      </w:pPr>
+    </w:p>
+    <w:p>
+      <w:pPr>
+        <w:pStyle w:val="Prrafodelista"/>
+        <w:ind w:left="1080"/>
+        <w:jc w:val="both"/>
+        <w:rPr>
+          <w:rFonts w:ascii="Garamond" w:hAnsi="Garamond" w:cs="Tahoma"/>
+          <w:b/>
+          <w:sz w:val="28"/>
+          <w:szCs w:val="28"/>
+          <w:lang w:val="en-US"/>
+        </w:rPr>
+      </w:pPr>
+    </w:p>
+    <w:p>
+      <w:pPr>
+        <w:pStyle w:val="Prrafodelista"/>
+        <w:numPr>
+          <w:ilvl w:val="1"/>
+          <w:numId w:val="1"/>
+        </w:numPr>
+        <w:jc w:val="both"/>
+        <w:rPr>
+          <w:rFonts w:ascii="Garamond" w:hAnsi="Garamond" w:cs="Tahoma"/>
+          <w:b/>
+          <w:sz w:val="28"/>
+          <w:szCs w:val="28"/>
+        </w:rPr>
+      </w:pPr>
+      <w:r>
+        <w:rPr>
+          <w:rFonts w:ascii="Garamond" w:hAnsi="Garamond" w:cs="Tahoma"/>
+          <w:b/>
+          <w:sz w:val="28"/>
+          <w:szCs w:val="28"/>
+        </w:rPr>
+        <w:lastRenderedPageBreak/>
+        <w:t>Análisis de la composición de las dietas</w:t>
+      </w:r>
+    </w:p>
+    <w:p>
+      <w:pPr>
+        <w:jc w:val="both"/>
+        <w:rPr>
+          <w:rFonts w:ascii="Garamond" w:hAnsi="Garamond" w:cs="Tahoma"/>
+          <w:sz w:val="24"/>
+          <w:szCs w:val="24"/>
+          <w:lang w:val="en-US"/>
+        </w:rPr>
+      </w:pPr>
+      <w:r>
+        <w:rPr>
+          <w:rFonts w:ascii="Garamond" w:hAnsi="Garamond" w:cs="Tahoma"/>
+          <w:sz w:val="24"/>
+          <w:szCs w:val="24"/>
+          <w:lang w:val="en-US"/>
+        </w:rPr>
+        <w:t xml:space="preserve">Understanding these cost differentials requires examining the composition of the least-cost diets. The </w:t>
+      </w:r>
+      <w:proofErr w:type="spellStart"/>
+      <w:r>
+        <w:rPr>
+          <w:rFonts w:ascii="Garamond" w:hAnsi="Garamond" w:cs="Tahoma"/>
+          <w:sz w:val="24"/>
+          <w:szCs w:val="24"/>
+          <w:lang w:val="en-US"/>
+        </w:rPr>
+        <w:t>behaviour</w:t>
+      </w:r>
+      <w:proofErr w:type="spellEnd"/>
+      <w:r>
+        <w:rPr>
+          <w:rFonts w:ascii="Garamond" w:hAnsi="Garamond" w:cs="Tahoma"/>
+          <w:sz w:val="24"/>
+          <w:szCs w:val="24"/>
+          <w:lang w:val="en-US"/>
+        </w:rPr>
+        <w:t xml:space="preserve"> of real </w:t>
+      </w:r>
+      <w:proofErr w:type="spellStart"/>
+      <w:r>
+        <w:rPr>
+          <w:rFonts w:ascii="Garamond" w:hAnsi="Garamond" w:cs="Tahoma"/>
+          <w:sz w:val="24"/>
+          <w:szCs w:val="24"/>
+          <w:lang w:val="en-US"/>
+        </w:rPr>
+        <w:t>CoNA</w:t>
+      </w:r>
+      <w:proofErr w:type="spellEnd"/>
+      <w:r>
+        <w:rPr>
+          <w:rFonts w:ascii="Garamond" w:hAnsi="Garamond" w:cs="Tahoma"/>
+          <w:sz w:val="24"/>
+          <w:szCs w:val="24"/>
+          <w:lang w:val="en-US"/>
+        </w:rPr>
+        <w:t xml:space="preserve"> reflects the interplay between relative price movements and adjustments in the baskets selected by the linear program. (Figure B1 in the Appendix traces the full composition of the </w:t>
+      </w:r>
+      <w:proofErr w:type="spellStart"/>
+      <w:r>
+        <w:rPr>
+          <w:rFonts w:ascii="Garamond" w:hAnsi="Garamond" w:cs="Tahoma"/>
+          <w:sz w:val="24"/>
+          <w:szCs w:val="24"/>
+          <w:lang w:val="en-US"/>
+        </w:rPr>
+        <w:t>CoNA</w:t>
+      </w:r>
+      <w:proofErr w:type="spellEnd"/>
+      <w:r>
+        <w:rPr>
+          <w:rFonts w:ascii="Garamond" w:hAnsi="Garamond" w:cs="Tahoma"/>
+          <w:sz w:val="24"/>
+          <w:szCs w:val="24"/>
+          <w:lang w:val="en-US"/>
+        </w:rPr>
+        <w:t xml:space="preserve"> diet over the period — which foods entered the basket, where, when, in what quantities, and which city–year pairs never selected a given food at all). The diet is dominated by a core set of food items presented in all or nearly all months across the three cities (pasteurized milk, dried peas, wheat flour, lentils, vegetable fat, and guavas), though each city also draws on additional foods with selective presence, specifically cassava in Cali, rice in Medellín, and soybean oil in both Bogotá and Cali.</w:t>
+      </w:r>
+    </w:p>
+    <w:p>
+      <w:pPr>
+        <w:jc w:val="center"/>
         <w:rPr>
           <w:rFonts w:ascii="Garamond" w:hAnsi="Garamond" w:cs="Tahoma"/>
           <w:sz w:val="28"/>
@@ -1642,12 +1836,11 @@
           <w:sz w:val="28"/>
           <w:szCs w:val="28"/>
         </w:rPr>
-        <w:lastRenderedPageBreak/>
         <w:drawing>
-          <wp:inline distT="0" distB="0" distL="0" distR="0">
-            <wp:extent cx="5605780" cy="2337435"/>
-            <wp:effectExtent l="0" t="0" r="0" b="5715"/>
-            <wp:docPr id="5" name="Imagen 5"/>
+          <wp:inline distT="0" distB="0" distL="0" distR="0" wp14:anchorId="2706DCEE" wp14:editId="4D564E95">
+            <wp:extent cx="5189516" cy="2396098"/>
+            <wp:effectExtent l="0" t="0" r="0" b="4445"/>
+            <wp:docPr id="4" name="Imagen 4"/>
             <wp:cNvGraphicFramePr>
               <a:graphicFrameLocks xmlns:a="http://schemas.openxmlformats.org/drawingml/2006/main" noChangeAspect="1"/>
             </wp:cNvGraphicFramePr>
@@ -1655,7 +1848,7 @@
               <a:graphicData uri="http://schemas.openxmlformats.org/drawingml/2006/picture">
                 <pic:pic xmlns:pic="http://schemas.openxmlformats.org/drawingml/2006/picture">
                   <pic:nvPicPr>
-                    <pic:cNvPr id="0" name="Picture 5"/>
+                    <pic:cNvPr id="0" name="Picture 4"/>
                     <pic:cNvPicPr>
                       <a:picLocks noChangeAspect="1" noChangeArrowheads="1"/>
                     </pic:cNvPicPr>
@@ -1676,7 +1869,7 @@
                   <pic:spPr bwMode="auto">
                     <a:xfrm>
                       <a:off x="0" y="0"/>
-                      <a:ext cx="5605780" cy="2337435"/>
+                      <a:ext cx="5195748" cy="2398975"/>
                     </a:xfrm>
                     <a:prstGeom prst="rect">
                       <a:avLst/>
@@ -1698,112 +1891,55 @@
         <w:jc w:val="both"/>
         <w:rPr>
           <w:rFonts w:ascii="Garamond" w:hAnsi="Garamond" w:cs="Tahoma"/>
-          <w:b/>
-          <w:color w:val="FF0000"/>
-          <w:sz w:val="28"/>
-          <w:szCs w:val="28"/>
-        </w:rPr>
-      </w:pPr>
-      <w:r>
-        <w:rPr>
-          <w:rFonts w:ascii="Garamond" w:hAnsi="Garamond" w:cs="Tahoma"/>
-          <w:b/>
-          <w:color w:val="FF0000"/>
-          <w:sz w:val="28"/>
-          <w:szCs w:val="28"/>
-        </w:rPr>
-        <w:t>[CAMBIAR ESTO POR LOS BOXPLOTS POR AÑO, PARA FACILITAR LECTURA]</w:t>
-      </w:r>
-    </w:p>
-    <w:p>
-      <w:pPr>
-        <w:jc w:val="both"/>
-        <w:rPr>
-          <w:rFonts w:ascii="Garamond" w:hAnsi="Garamond" w:cs="Tahoma"/>
-          <w:sz w:val="24"/>
-          <w:szCs w:val="24"/>
-        </w:rPr>
-      </w:pPr>
-      <w:r>
-        <w:rPr>
-          <w:rFonts w:ascii="Garamond" w:hAnsi="Garamond" w:cs="Tahoma"/>
-          <w:sz w:val="24"/>
-          <w:szCs w:val="24"/>
-        </w:rPr>
-        <w:t xml:space="preserve">La comprensión de estos diferenciales de costo requiere examinar la composición de las dietas de mínimo costo. El comportamiento del </w:t>
-      </w:r>
-      <w:proofErr w:type="spellStart"/>
-      <w:r>
-        <w:rPr>
-          <w:rFonts w:ascii="Garamond" w:hAnsi="Garamond" w:cs="Tahoma"/>
-          <w:sz w:val="24"/>
-          <w:szCs w:val="24"/>
-        </w:rPr>
-        <w:t>CoNA</w:t>
-      </w:r>
-      <w:proofErr w:type="spellEnd"/>
-      <w:r>
-        <w:rPr>
-          <w:rFonts w:ascii="Garamond" w:hAnsi="Garamond" w:cs="Tahoma"/>
-          <w:sz w:val="24"/>
-          <w:szCs w:val="24"/>
-        </w:rPr>
-        <w:t xml:space="preserve"> real refleja la interacci</w:t>
-      </w:r>
-      <w:r>
-        <w:rPr>
-          <w:rFonts w:ascii="Garamond" w:hAnsi="Garamond" w:cs="Garamond"/>
-          <w:sz w:val="24"/>
-          <w:szCs w:val="24"/>
-        </w:rPr>
-        <w:t>ó</w:t>
-      </w:r>
-      <w:r>
-        <w:rPr>
-          <w:rFonts w:ascii="Garamond" w:hAnsi="Garamond" w:cs="Tahoma"/>
-          <w:sz w:val="24"/>
-          <w:szCs w:val="24"/>
-        </w:rPr>
-        <w:t>n entre la evoluci</w:t>
-      </w:r>
-      <w:r>
-        <w:rPr>
-          <w:rFonts w:ascii="Garamond" w:hAnsi="Garamond" w:cs="Garamond"/>
-          <w:sz w:val="24"/>
-          <w:szCs w:val="24"/>
-        </w:rPr>
-        <w:t>ó</w:t>
-      </w:r>
-      <w:r>
-        <w:rPr>
-          <w:rFonts w:ascii="Garamond" w:hAnsi="Garamond" w:cs="Tahoma"/>
-          <w:sz w:val="24"/>
-          <w:szCs w:val="24"/>
-        </w:rPr>
-        <w:t xml:space="preserve">n de los precios relativos y los ajustes en las cestas seleccionadas por el programa lineal. (La Figura A1 del Apéndice documenta la composición completa de la dieta </w:t>
-      </w:r>
-      <w:proofErr w:type="spellStart"/>
-      <w:r>
-        <w:rPr>
-          <w:rFonts w:ascii="Garamond" w:hAnsi="Garamond" w:cs="Tahoma"/>
-          <w:sz w:val="24"/>
-          <w:szCs w:val="24"/>
-        </w:rPr>
-        <w:t>CoNA</w:t>
-      </w:r>
-      <w:proofErr w:type="spellEnd"/>
-      <w:r>
-        <w:rPr>
-          <w:rFonts w:ascii="Garamond" w:hAnsi="Garamond" w:cs="Tahoma"/>
-          <w:sz w:val="24"/>
-          <w:szCs w:val="24"/>
-        </w:rPr>
-        <w:t xml:space="preserve"> a lo largo del período, mostrando qué alimentos fueron seleccionados en cada ciudad y año y en qué cantidades, así como las combinaciones ciudad-año en que un alimento nunca fue seleccionado). La dieta está dominada por un núcleo de alimentos presentes en la totalidad o la gran mayoría de los meses en las tres ciudades — leche pasteurizada, arveja seca, harina de trigo, lentejas, manteca vegetal y guayabas —, aunque con alimentos adicionales de presencia selectiva que difieren entre ciudades: la yuca en Cali, el arroz en Medellín, el aceite de soya en Bogotá y Cali. </w:t>
-      </w:r>
-    </w:p>
-    <w:p>
-      <w:pPr>
-        <w:jc w:val="both"/>
+          <w:sz w:val="24"/>
+          <w:szCs w:val="24"/>
+          <w:lang w:val="en-US"/>
+        </w:rPr>
+      </w:pPr>
+      <w:r>
+        <w:rPr>
+          <w:rFonts w:ascii="Garamond" w:hAnsi="Garamond" w:cs="Tahoma"/>
+          <w:sz w:val="24"/>
+          <w:szCs w:val="24"/>
+          <w:lang w:val="en-US"/>
+        </w:rPr>
+        <w:t>Pasteurized milk dominates diet costs in all three cities, accounting for between 35.1\% of total cost in Cali and 40.6\% in Medellín over the full period, with its contribution rising steadily, from 1.135 - 1.212 COP/day in 2019 to 1.386 - 1.436 COP/day in 2024 (Figure \ref{</w:t>
+      </w:r>
+      <w:proofErr w:type="spellStart"/>
+      <w:proofErr w:type="gramStart"/>
+      <w:r>
+        <w:rPr>
+          <w:rFonts w:ascii="Garamond" w:hAnsi="Garamond" w:cs="Tahoma"/>
+          <w:sz w:val="24"/>
+          <w:szCs w:val="24"/>
+          <w:lang w:val="en-US"/>
+        </w:rPr>
+        <w:t>fig:cost</w:t>
+      </w:r>
+      <w:proofErr w:type="gramEnd"/>
+      <w:r>
+        <w:rPr>
+          <w:rFonts w:ascii="Garamond" w:hAnsi="Garamond" w:cs="Tahoma"/>
+          <w:sz w:val="24"/>
+          <w:szCs w:val="24"/>
+          <w:lang w:val="en-US"/>
+        </w:rPr>
+        <w:t>_contrib</w:t>
+      </w:r>
+      <w:proofErr w:type="spellEnd"/>
+      <w:r>
+        <w:rPr>
+          <w:rFonts w:ascii="Garamond" w:hAnsi="Garamond" w:cs="Tahoma"/>
+          <w:sz w:val="24"/>
+          <w:szCs w:val="24"/>
+          <w:lang w:val="en-US"/>
+        </w:rPr>
+        <w:t>}). Legumes form the second most important component, led by dried peas (12.8\% - 15.7\% of total cost) and lentils (4.9\% - 6.7\%), and their trajectories diverge across cities. In Bogotá, the contribution of lentils fell from 212 COP/day in 2019 to 67 COP/day in 2024, as their relative price rose, whereas the opposite occurred in Medellín and, more markedly, in Cali, where contributions grew from 161 COP/day to 344 COP/day. This divergence points to legume markets governed by city-specific relative price dynamics rather than a shared regional trend. Vegetable fat illustrates the substitution mechanism. In Bogotá its contribution rose from 181 COP/day in 2019 to 294 COP/day in 2023, as its real price fell, lowering the marginal cost of meeting lipid and energy constraints; Cali saw an even sharper increase (from 105 COP/day to 345 COP/day), while Medellín moved in the opposite direction (from 226 COP/day to 202 COP/day). Vegetable fat plays, therefore, the role of low-cost substitute in some markets. For guavas, the increase is a price effect: despite sustained real price increases in all three cities, their cost contributions climbed from 113 - 120 COP/day in 2019 to 139 - 159 COP/day in 2024, even though quantities barely moved (24.4 - 25.4 g/day) throughout the period.</w:t>
+      </w:r>
+    </w:p>
+    <w:p>
+      <w:pPr>
+        <w:jc w:val="center"/>
         <w:rPr>
           <w:rFonts w:ascii="Garamond" w:hAnsi="Garamond" w:cs="Tahoma"/>
           <w:sz w:val="28"/>
@@ -1817,11 +1953,12 @@
           <w:sz w:val="28"/>
           <w:szCs w:val="28"/>
         </w:rPr>
+        <w:lastRenderedPageBreak/>
         <w:drawing>
-          <wp:inline distT="0" distB="0" distL="0" distR="0" wp14:anchorId="2706DCEE" wp14:editId="4D564E95">
-            <wp:extent cx="5612130" cy="2591227"/>
-            <wp:effectExtent l="0" t="0" r="7620" b="0"/>
-            <wp:docPr id="4" name="Imagen 4"/>
+          <wp:inline distT="0" distB="0" distL="0" distR="0" wp14:anchorId="0E6C1F74" wp14:editId="64FF522C">
+            <wp:extent cx="4857007" cy="2431799"/>
+            <wp:effectExtent l="0" t="0" r="1270" b="6985"/>
+            <wp:docPr id="7" name="Imagen 7"/>
             <wp:cNvGraphicFramePr>
               <a:graphicFrameLocks xmlns:a="http://schemas.openxmlformats.org/drawingml/2006/main" noChangeAspect="1"/>
             </wp:cNvGraphicFramePr>
@@ -1829,7 +1966,7 @@
               <a:graphicData uri="http://schemas.openxmlformats.org/drawingml/2006/picture">
                 <pic:pic xmlns:pic="http://schemas.openxmlformats.org/drawingml/2006/picture">
                   <pic:nvPicPr>
-                    <pic:cNvPr id="0" name="Picture 4"/>
+                    <pic:cNvPr id="0" name="Picture 7"/>
                     <pic:cNvPicPr>
                       <a:picLocks noChangeAspect="1" noChangeArrowheads="1"/>
                     </pic:cNvPicPr>
@@ -1850,7 +1987,7 @@
                   <pic:spPr bwMode="auto">
                     <a:xfrm>
                       <a:off x="0" y="0"/>
-                      <a:ext cx="5612130" cy="2591227"/>
+                      <a:ext cx="4861192" cy="2433894"/>
                     </a:xfrm>
                     <a:prstGeom prst="rect">
                       <a:avLst/>
@@ -1881,186 +2018,17 @@
           <w:rFonts w:ascii="Garamond" w:hAnsi="Garamond" w:cs="Tahoma"/>
           <w:sz w:val="24"/>
           <w:szCs w:val="24"/>
-        </w:rPr>
-        <w:t xml:space="preserve">La Figura 3 ilustra la contribución mensual de cada alimento al costo real del </w:t>
-      </w:r>
-      <w:proofErr w:type="spellStart"/>
-      <w:r>
-        <w:rPr>
-          <w:rFonts w:ascii="Garamond" w:hAnsi="Garamond" w:cs="Tahoma"/>
-          <w:sz w:val="24"/>
-          <w:szCs w:val="24"/>
-        </w:rPr>
-        <w:t>CoNA</w:t>
-      </w:r>
-      <w:proofErr w:type="spellEnd"/>
-      <w:r>
-        <w:rPr>
-          <w:rFonts w:ascii="Garamond" w:hAnsi="Garamond" w:cs="Tahoma"/>
-          <w:sz w:val="24"/>
-          <w:szCs w:val="24"/>
-        </w:rPr>
-        <w:t xml:space="preserve"> per cápita, agrupados por categoría GABAS. La leche pasteurizada domina el costo de la dieta en las tres ciudades — representando entre el 35,1% del costo total en Cali y el 40,6% en Medellín durante </w:t>
-      </w:r>
-      <w:r>
-        <w:rPr>
-          <w:rFonts w:ascii="Garamond" w:hAnsi="Garamond" w:cs="Tahoma"/>
-          <w:sz w:val="24"/>
-          <w:szCs w:val="24"/>
-        </w:rPr>
-        <w:lastRenderedPageBreak/>
-        <w:t xml:space="preserve">el período completo — y su contribución creció sostenidamente, pasando de COP 1.135–1.212/día en 2019 a COP 1.386–1.436/día en 2024. Las leguminosas constituyen el segundo componente en importancia — principalmente arveja seca (12,8%–15,7% del costo total) y lentejas (4,9%–6,7%) —, pero con trayectorias marcadamente distintas entre ciudades: en Bogotá la contribución de las lentejas cayó de COP 212/día en 2019 a COP 67/día en 2024 conforme su precio relativo se encareció, mientras que en Cali ocurrió exactamente lo opuesto — su contribución creció de COP 161/día a COP 344/día — evidenciando que los mercados de leguminosas exhiben dinámicas de precios relativos divergentes entre ciudades. La manteca vegetal ilustra el mecanismo de sustitución en dirección contraria: su contribución aumentó de COP 181/día en 2019 a COP 294/día en 2023 en Bogotá conforme su precio real caía, reduciendo así el costo marginal de satisfacer las restricciones de lípidos y energía. Las guayabas, pese a registrar encarecimientos reales sostenidos en las tres ciudades, incrementaron su contribución al costo de COP 113–120/día en 2019 a COP 139–159/día en 2024 exclusivamente por el efecto precio — sus cantidades permanecieron prácticamente invariables (~25 g/día) —. Estas dinámicas revelan que la estabilidad real del </w:t>
-      </w:r>
-      <w:proofErr w:type="spellStart"/>
-      <w:r>
-        <w:rPr>
-          <w:rFonts w:ascii="Garamond" w:hAnsi="Garamond" w:cs="Tahoma"/>
-          <w:sz w:val="24"/>
-          <w:szCs w:val="24"/>
-        </w:rPr>
-        <w:t>CoNA</w:t>
-      </w:r>
-      <w:proofErr w:type="spellEnd"/>
-      <w:r>
-        <w:rPr>
-          <w:rFonts w:ascii="Garamond" w:hAnsi="Garamond" w:cs="Tahoma"/>
-          <w:sz w:val="24"/>
-          <w:szCs w:val="24"/>
-        </w:rPr>
-        <w:t xml:space="preserve"> no es el resultado de una canasta estática sino de un proceso continuo de ajuste por parte del programa lineal que explota los cambios en precios relativos para mantener el costo mínimo de la adecuación nutricional dentro de los límites impuestos por las restricciones biológicas.</w:t>
-      </w:r>
-    </w:p>
-    <w:p>
-      <w:pPr>
-        <w:jc w:val="both"/>
-        <w:rPr>
-          <w:rFonts w:ascii="Garamond" w:hAnsi="Garamond" w:cs="Tahoma"/>
-          <w:sz w:val="28"/>
-          <w:szCs w:val="28"/>
-        </w:rPr>
-      </w:pPr>
-      <w:r>
-        <w:rPr>
-          <w:rFonts w:ascii="Garamond" w:hAnsi="Garamond" w:cs="Tahoma"/>
-          <w:noProof/>
-          <w:sz w:val="28"/>
-          <w:szCs w:val="28"/>
-        </w:rPr>
-        <w:drawing>
-          <wp:inline distT="0" distB="0" distL="0" distR="0" wp14:anchorId="0E6C1F74" wp14:editId="64FF522C">
-            <wp:extent cx="5612130" cy="2809873"/>
-            <wp:effectExtent l="0" t="0" r="7620" b="0"/>
-            <wp:docPr id="7" name="Imagen 7"/>
-            <wp:cNvGraphicFramePr>
-              <a:graphicFrameLocks xmlns:a="http://schemas.openxmlformats.org/drawingml/2006/main" noChangeAspect="1"/>
-            </wp:cNvGraphicFramePr>
-            <a:graphic xmlns:a="http://schemas.openxmlformats.org/drawingml/2006/main">
-              <a:graphicData uri="http://schemas.openxmlformats.org/drawingml/2006/picture">
-                <pic:pic xmlns:pic="http://schemas.openxmlformats.org/drawingml/2006/picture">
-                  <pic:nvPicPr>
-                    <pic:cNvPr id="0" name="Picture 7"/>
-                    <pic:cNvPicPr>
-                      <a:picLocks noChangeAspect="1" noChangeArrowheads="1"/>
-                    </pic:cNvPicPr>
-                  </pic:nvPicPr>
-                  <pic:blipFill>
-                    <a:blip r:embed="rId12" cstate="print">
-                      <a:extLst>
-                        <a:ext uri="{28A0092B-C50C-407E-A947-70E740481C1C}">
-                          <a14:useLocalDpi xmlns:a14="http://schemas.microsoft.com/office/drawing/2010/main" val="0"/>
-                        </a:ext>
-                      </a:extLst>
-                    </a:blip>
-                    <a:srcRect/>
-                    <a:stretch>
-                      <a:fillRect/>
-                    </a:stretch>
-                  </pic:blipFill>
-                  <pic:spPr bwMode="auto">
-                    <a:xfrm>
-                      <a:off x="0" y="0"/>
-                      <a:ext cx="5612130" cy="2809873"/>
-                    </a:xfrm>
-                    <a:prstGeom prst="rect">
-                      <a:avLst/>
-                    </a:prstGeom>
-                    <a:noFill/>
-                    <a:ln>
-                      <a:noFill/>
-                    </a:ln>
-                  </pic:spPr>
-                </pic:pic>
-              </a:graphicData>
-            </a:graphic>
-          </wp:inline>
-        </w:drawing>
-      </w:r>
-    </w:p>
-    <w:p>
-      <w:pPr>
-        <w:jc w:val="both"/>
-        <w:rPr>
-          <w:rFonts w:ascii="Garamond" w:hAnsi="Garamond" w:cs="Tahoma"/>
-          <w:b/>
-          <w:color w:val="FF0000"/>
-          <w:sz w:val="28"/>
-          <w:szCs w:val="28"/>
-        </w:rPr>
-      </w:pPr>
-      <w:r>
-        <w:rPr>
-          <w:rFonts w:ascii="Garamond" w:hAnsi="Garamond" w:cs="Tahoma"/>
-          <w:b/>
-          <w:color w:val="FF0000"/>
-          <w:sz w:val="28"/>
-          <w:szCs w:val="28"/>
-        </w:rPr>
-        <w:t>[</w:t>
-      </w:r>
-      <w:r>
-        <w:rPr>
-          <w:rFonts w:ascii="Garamond" w:hAnsi="Garamond" w:cs="Tahoma"/>
-          <w:b/>
-          <w:color w:val="FF0000"/>
-          <w:sz w:val="28"/>
-          <w:szCs w:val="28"/>
-        </w:rPr>
-        <w:t>ESTO SE VA AL APÉNDICE</w:t>
-      </w:r>
-      <w:r>
-        <w:rPr>
-          <w:rFonts w:ascii="Garamond" w:hAnsi="Garamond" w:cs="Tahoma"/>
-          <w:b/>
-          <w:color w:val="FF0000"/>
-          <w:sz w:val="28"/>
-          <w:szCs w:val="28"/>
-        </w:rPr>
-        <w:t>]</w:t>
-      </w:r>
-    </w:p>
-    <w:p>
-      <w:pPr>
-        <w:jc w:val="both"/>
-        <w:rPr>
-          <w:rFonts w:ascii="Garamond" w:hAnsi="Garamond" w:cs="Tahoma"/>
-          <w:sz w:val="24"/>
-          <w:szCs w:val="24"/>
-        </w:rPr>
-      </w:pPr>
-      <w:r>
-        <w:rPr>
-          <w:rFonts w:ascii="Garamond" w:hAnsi="Garamond" w:cs="Tahoma"/>
-          <w:sz w:val="24"/>
-          <w:szCs w:val="24"/>
-        </w:rPr>
-        <w:t xml:space="preserve">La composición de la </w:t>
-      </w:r>
-      <w:proofErr w:type="spellStart"/>
-      <w:r>
-        <w:rPr>
-          <w:rFonts w:ascii="Garamond" w:hAnsi="Garamond" w:cs="Tahoma"/>
-          <w:sz w:val="24"/>
-          <w:szCs w:val="24"/>
+          <w:lang w:val="en-US"/>
+        </w:rPr>
+        <w:t xml:space="preserve">The composition of </w:t>
+      </w:r>
+      <w:proofErr w:type="spellStart"/>
+      <w:r>
+        <w:rPr>
+          <w:rFonts w:ascii="Garamond" w:hAnsi="Garamond" w:cs="Tahoma"/>
+          <w:sz w:val="24"/>
+          <w:szCs w:val="24"/>
+          <w:lang w:val="en-US"/>
         </w:rPr>
         <w:t>CoRD</w:t>
       </w:r>
@@ -2070,15 +2038,68 @@
           <w:rFonts w:ascii="Garamond" w:hAnsi="Garamond" w:cs="Tahoma"/>
           <w:sz w:val="24"/>
           <w:szCs w:val="24"/>
-        </w:rPr>
-        <w:t xml:space="preserve"> refleja la estructura de intercambios recomendados por las GABAS, con una distribución de porciones prácticamente idéntica entre las tres ciudades y estable a lo largo de todo el período (véase Figura A2; Tabla A2A). Las grasas constituyen el grupo con mayor número de porciones diarias (4,51–4,67), seguidas por los lácteos (4,16–4,31), las carnes, huevos y leguminosas (3,47–3,59) y los azúcares (3,13–3,23), mientras que los cereales y feculentos (2,25–2,33), las frutas (1,08–1,12) y las verduras (1,08–1,12) completan la estructura. La estructura dietética de la </w:t>
-      </w:r>
-      <w:proofErr w:type="spellStart"/>
-      <w:r>
-        <w:rPr>
-          <w:rFonts w:ascii="Garamond" w:hAnsi="Garamond" w:cs="Tahoma"/>
-          <w:sz w:val="24"/>
-          <w:szCs w:val="24"/>
+          <w:lang w:val="en-US"/>
+        </w:rPr>
+        <w:t xml:space="preserve"> mirrors the exchange structure recommended by the GABAS, with a serving distribution that is identical across cities and stable over time (see Appendix C). Fats lead with 4.51-4.67 daily servings, followed by dairy (4.16-4.31), meat, eggs, and legumes (3.47-3.59), sugars (3.13-3.23), cereals and starches (2.25-2.33), and fruits and vegetables (1.08-1.12 each). That same composition conceals a marked asymmetry between servings and economic weight (Figure \ref{</w:t>
+      </w:r>
+      <w:proofErr w:type="spellStart"/>
+      <w:proofErr w:type="gramStart"/>
+      <w:r>
+        <w:rPr>
+          <w:rFonts w:ascii="Garamond" w:hAnsi="Garamond" w:cs="Tahoma"/>
+          <w:sz w:val="24"/>
+          <w:szCs w:val="24"/>
+          <w:lang w:val="en-US"/>
+        </w:rPr>
+        <w:t>fig:cost</w:t>
+      </w:r>
+      <w:proofErr w:type="gramEnd"/>
+      <w:r>
+        <w:rPr>
+          <w:rFonts w:ascii="Garamond" w:hAnsi="Garamond" w:cs="Tahoma"/>
+          <w:sz w:val="24"/>
+          <w:szCs w:val="24"/>
+          <w:lang w:val="en-US"/>
+        </w:rPr>
+        <w:t>_cord</w:t>
+      </w:r>
+      <w:proofErr w:type="spellEnd"/>
+      <w:r>
+        <w:rPr>
+          <w:rFonts w:ascii="Garamond" w:hAnsi="Garamond" w:cs="Tahoma"/>
+          <w:sz w:val="24"/>
+          <w:szCs w:val="24"/>
+          <w:lang w:val="en-US"/>
+        </w:rPr>
+        <w:t xml:space="preserve">}). Dairy, with only 4.16 - 4.31 daily servings, below the </w:t>
+      </w:r>
+      <w:proofErr w:type="gramStart"/>
+      <w:r>
+        <w:rPr>
+          <w:rFonts w:ascii="Garamond" w:hAnsi="Garamond" w:cs="Tahoma"/>
+          <w:sz w:val="24"/>
+          <w:szCs w:val="24"/>
+          <w:lang w:val="en-US"/>
+        </w:rPr>
+        <w:t>fats</w:t>
+      </w:r>
+      <w:proofErr w:type="gramEnd"/>
+      <w:r>
+        <w:rPr>
+          <w:rFonts w:ascii="Garamond" w:hAnsi="Garamond" w:cs="Tahoma"/>
+          <w:sz w:val="24"/>
+          <w:szCs w:val="24"/>
+          <w:lang w:val="en-US"/>
+        </w:rPr>
+        <w:t xml:space="preserve"> groups, accounts for between 64.9\% and 66.2\% of total </w:t>
+      </w:r>
+      <w:proofErr w:type="spellStart"/>
+      <w:r>
+        <w:rPr>
+          <w:rFonts w:ascii="Garamond" w:hAnsi="Garamond" w:cs="Tahoma"/>
+          <w:sz w:val="24"/>
+          <w:szCs w:val="24"/>
+          <w:lang w:val="en-US"/>
         </w:rPr>
         <w:t>CoRD</w:t>
       </w:r>
@@ -2088,85 +2109,477 @@
           <w:rFonts w:ascii="Garamond" w:hAnsi="Garamond" w:cs="Tahoma"/>
           <w:sz w:val="24"/>
           <w:szCs w:val="24"/>
-        </w:rPr>
-        <w:t xml:space="preserve"> es estable tanto en el tiempo como entre mercados, y esta homogeneidad compositiva implica que las diferencias de costo </w:t>
-      </w:r>
-      <w:proofErr w:type="spellStart"/>
-      <w:r>
-        <w:rPr>
-          <w:rFonts w:ascii="Garamond" w:hAnsi="Garamond" w:cs="Tahoma"/>
-          <w:sz w:val="24"/>
-          <w:szCs w:val="24"/>
-        </w:rPr>
-        <w:t>intercidades</w:t>
-      </w:r>
-      <w:proofErr w:type="spellEnd"/>
-      <w:r>
-        <w:rPr>
-          <w:rFonts w:ascii="Garamond" w:hAnsi="Garamond" w:cs="Tahoma"/>
-          <w:sz w:val="24"/>
-          <w:szCs w:val="24"/>
-        </w:rPr>
-        <w:t xml:space="preserve"> documentadas en </w:t>
-      </w:r>
-      <w:r>
-        <w:rPr>
-          <w:rFonts w:ascii="Garamond" w:hAnsi="Garamond" w:cs="Tahoma"/>
-          <w:sz w:val="24"/>
-          <w:szCs w:val="24"/>
-        </w:rPr>
-        <w:lastRenderedPageBreak/>
-        <w:t>la subsección 4.1 reflejan diferencias en los precios locales de los alimentos seleccionados dentro de cada grupo.</w:t>
-      </w:r>
-      <w:r>
-        <w:rPr>
-          <w:rFonts w:ascii="Garamond" w:hAnsi="Garamond" w:cs="Tahoma"/>
-          <w:sz w:val="24"/>
-          <w:szCs w:val="24"/>
-        </w:rPr>
-        <w:t xml:space="preserve"> No obstante,</w:t>
-      </w:r>
-      <w:r>
-        <w:rPr>
-          <w:rFonts w:ascii="Garamond" w:hAnsi="Garamond" w:cs="Tahoma"/>
-          <w:sz w:val="24"/>
-          <w:szCs w:val="24"/>
-        </w:rPr>
-        <w:t xml:space="preserve"> la estructura de costos asociada a esa composición revela una asimetría marcada entre porciones y peso económico que no es evidente a partir del análisis de porciones solamente (Figura A3; Tabla A2B). Los lácteos, con apenas 4,16–4,31 porciones diarias — por debajo del grupo de grasas —, concentran entre el 64,9% y el 66,2% del costo total de la </w:t>
-      </w:r>
-      <w:proofErr w:type="spellStart"/>
-      <w:r>
-        <w:rPr>
-          <w:rFonts w:ascii="Garamond" w:hAnsi="Garamond" w:cs="Tahoma"/>
-          <w:sz w:val="24"/>
-          <w:szCs w:val="24"/>
-        </w:rPr>
-        <w:t>CoRD</w:t>
-      </w:r>
-      <w:proofErr w:type="spellEnd"/>
-      <w:r>
-        <w:rPr>
-          <w:rFonts w:ascii="Garamond" w:hAnsi="Garamond" w:cs="Tahoma"/>
-          <w:sz w:val="24"/>
-          <w:szCs w:val="24"/>
-        </w:rPr>
-        <w:t xml:space="preserve"> en las tres ciudades</w:t>
-      </w:r>
-      <w:r>
-        <w:rPr>
-          <w:rFonts w:ascii="Garamond" w:hAnsi="Garamond" w:cs="Tahoma"/>
-          <w:sz w:val="24"/>
-          <w:szCs w:val="24"/>
-        </w:rPr>
-        <w:t xml:space="preserve">. </w:t>
-      </w:r>
-      <w:r>
-        <w:rPr>
-          <w:rFonts w:ascii="Garamond" w:hAnsi="Garamond" w:cs="Tahoma"/>
-          <w:sz w:val="24"/>
-          <w:szCs w:val="24"/>
-        </w:rPr>
-        <w:t>En contraste, las grasas — el grupo de mayor volumen en porciones — representan apenas el 3,8%–4,8% del costo total (COP 126–154/día), lo que refleja que los aceites y grasas vegetales son los alimentos de menor costo relativo por porción disponibles en los mercados urbanos colombianos. Las frutas, con solo 1,08–1,12 porciones diarias, contribuyen con el 6,9%–8,6% del costo total, superando en términos económicos a grupos con mayor volumen de porciones como los cereales y feculentos (4,2%–4,3%) o las verduras (3,8%–4,7%). Este patrón ilustra que el costo de la diversidad dietética está determinado fundamentalmente por el precio relativo de los alimentos nutricionalmente densos — en particular los lácteos — y no por el volumen de porciones requeridas por las guías alimentarias.</w:t>
+          <w:lang w:val="en-US"/>
+        </w:rPr>
+        <w:t xml:space="preserve"> across the three cities. Fats, by contrast, the highest-volume group, represent just 3.8\%-4.8\% of total cost, which reflects that vegetable oils and fats are the lowest-cost foods per serving available in Colombian urban markets. Fruits, with only 1.08-1.12 daily servings, contribute 6.9\% - 8.6\% of total cost, outweighing economically higher-volume groups such as cereals and starches (4.2\% - 4.3\%) or vegetables (3.8\% - 4.7\%). </w:t>
+      </w:r>
+      <w:proofErr w:type="spellStart"/>
+      <w:r>
+        <w:rPr>
+          <w:rFonts w:ascii="Garamond" w:hAnsi="Garamond" w:cs="Tahoma"/>
+          <w:sz w:val="24"/>
+          <w:szCs w:val="24"/>
+        </w:rPr>
+        <w:t>This</w:t>
+      </w:r>
+      <w:proofErr w:type="spellEnd"/>
+      <w:r>
+        <w:rPr>
+          <w:rFonts w:ascii="Garamond" w:hAnsi="Garamond" w:cs="Tahoma"/>
+          <w:sz w:val="24"/>
+          <w:szCs w:val="24"/>
+        </w:rPr>
+        <w:t xml:space="preserve"> </w:t>
+      </w:r>
+      <w:proofErr w:type="spellStart"/>
+      <w:r>
+        <w:rPr>
+          <w:rFonts w:ascii="Garamond" w:hAnsi="Garamond" w:cs="Tahoma"/>
+          <w:sz w:val="24"/>
+          <w:szCs w:val="24"/>
+        </w:rPr>
+        <w:t>pattern</w:t>
+      </w:r>
+      <w:proofErr w:type="spellEnd"/>
+      <w:r>
+        <w:rPr>
+          <w:rFonts w:ascii="Garamond" w:hAnsi="Garamond" w:cs="Tahoma"/>
+          <w:sz w:val="24"/>
+          <w:szCs w:val="24"/>
+        </w:rPr>
+        <w:t xml:space="preserve"> shows </w:t>
+      </w:r>
+      <w:proofErr w:type="spellStart"/>
+      <w:r>
+        <w:rPr>
+          <w:rFonts w:ascii="Garamond" w:hAnsi="Garamond" w:cs="Tahoma"/>
+          <w:sz w:val="24"/>
+          <w:szCs w:val="24"/>
+        </w:rPr>
+        <w:t>that</w:t>
+      </w:r>
+      <w:proofErr w:type="spellEnd"/>
+      <w:r>
+        <w:rPr>
+          <w:rFonts w:ascii="Garamond" w:hAnsi="Garamond" w:cs="Tahoma"/>
+          <w:sz w:val="24"/>
+          <w:szCs w:val="24"/>
+        </w:rPr>
+        <w:t xml:space="preserve"> </w:t>
+      </w:r>
+      <w:proofErr w:type="spellStart"/>
+      <w:r>
+        <w:rPr>
+          <w:rFonts w:ascii="Garamond" w:hAnsi="Garamond" w:cs="Tahoma"/>
+          <w:sz w:val="24"/>
+          <w:szCs w:val="24"/>
+        </w:rPr>
+        <w:t>the</w:t>
+      </w:r>
+      <w:proofErr w:type="spellEnd"/>
+      <w:r>
+        <w:rPr>
+          <w:rFonts w:ascii="Garamond" w:hAnsi="Garamond" w:cs="Tahoma"/>
+          <w:sz w:val="24"/>
+          <w:szCs w:val="24"/>
+        </w:rPr>
+        <w:t xml:space="preserve"> </w:t>
+      </w:r>
+      <w:proofErr w:type="spellStart"/>
+      <w:r>
+        <w:rPr>
+          <w:rFonts w:ascii="Garamond" w:hAnsi="Garamond" w:cs="Tahoma"/>
+          <w:sz w:val="24"/>
+          <w:szCs w:val="24"/>
+        </w:rPr>
+        <w:t>cost</w:t>
+      </w:r>
+      <w:proofErr w:type="spellEnd"/>
+      <w:r>
+        <w:rPr>
+          <w:rFonts w:ascii="Garamond" w:hAnsi="Garamond" w:cs="Tahoma"/>
+          <w:sz w:val="24"/>
+          <w:szCs w:val="24"/>
+        </w:rPr>
+        <w:t xml:space="preserve"> </w:t>
+      </w:r>
+      <w:proofErr w:type="spellStart"/>
+      <w:r>
+        <w:rPr>
+          <w:rFonts w:ascii="Garamond" w:hAnsi="Garamond" w:cs="Tahoma"/>
+          <w:sz w:val="24"/>
+          <w:szCs w:val="24"/>
+        </w:rPr>
+        <w:t>of</w:t>
+      </w:r>
+      <w:proofErr w:type="spellEnd"/>
+      <w:r>
+        <w:rPr>
+          <w:rFonts w:ascii="Garamond" w:hAnsi="Garamond" w:cs="Tahoma"/>
+          <w:sz w:val="24"/>
+          <w:szCs w:val="24"/>
+        </w:rPr>
+        <w:t xml:space="preserve"> </w:t>
+      </w:r>
+      <w:proofErr w:type="spellStart"/>
+      <w:r>
+        <w:rPr>
+          <w:rFonts w:ascii="Garamond" w:hAnsi="Garamond" w:cs="Tahoma"/>
+          <w:sz w:val="24"/>
+          <w:szCs w:val="24"/>
+        </w:rPr>
+        <w:t>dietary</w:t>
+      </w:r>
+      <w:proofErr w:type="spellEnd"/>
+      <w:r>
+        <w:rPr>
+          <w:rFonts w:ascii="Garamond" w:hAnsi="Garamond" w:cs="Tahoma"/>
+          <w:sz w:val="24"/>
+          <w:szCs w:val="24"/>
+        </w:rPr>
+        <w:t xml:space="preserve"> </w:t>
+      </w:r>
+      <w:proofErr w:type="spellStart"/>
+      <w:r>
+        <w:rPr>
+          <w:rFonts w:ascii="Garamond" w:hAnsi="Garamond" w:cs="Tahoma"/>
+          <w:sz w:val="24"/>
+          <w:szCs w:val="24"/>
+        </w:rPr>
+        <w:t>diversity</w:t>
+      </w:r>
+      <w:proofErr w:type="spellEnd"/>
+      <w:r>
+        <w:rPr>
+          <w:rFonts w:ascii="Garamond" w:hAnsi="Garamond" w:cs="Tahoma"/>
+          <w:sz w:val="24"/>
+          <w:szCs w:val="24"/>
+        </w:rPr>
+        <w:t xml:space="preserve"> </w:t>
+      </w:r>
+      <w:proofErr w:type="spellStart"/>
+      <w:r>
+        <w:rPr>
+          <w:rFonts w:ascii="Garamond" w:hAnsi="Garamond" w:cs="Tahoma"/>
+          <w:sz w:val="24"/>
+          <w:szCs w:val="24"/>
+        </w:rPr>
+        <w:t>is</w:t>
+      </w:r>
+      <w:proofErr w:type="spellEnd"/>
+      <w:r>
+        <w:rPr>
+          <w:rFonts w:ascii="Garamond" w:hAnsi="Garamond" w:cs="Tahoma"/>
+          <w:sz w:val="24"/>
+          <w:szCs w:val="24"/>
+        </w:rPr>
+        <w:t xml:space="preserve"> </w:t>
+      </w:r>
+      <w:proofErr w:type="spellStart"/>
+      <w:r>
+        <w:rPr>
+          <w:rFonts w:ascii="Garamond" w:hAnsi="Garamond" w:cs="Tahoma"/>
+          <w:sz w:val="24"/>
+          <w:szCs w:val="24"/>
+        </w:rPr>
+        <w:t>driven</w:t>
+      </w:r>
+      <w:proofErr w:type="spellEnd"/>
+      <w:r>
+        <w:rPr>
+          <w:rFonts w:ascii="Garamond" w:hAnsi="Garamond" w:cs="Tahoma"/>
+          <w:sz w:val="24"/>
+          <w:szCs w:val="24"/>
+        </w:rPr>
+        <w:t xml:space="preserve"> </w:t>
+      </w:r>
+      <w:proofErr w:type="spellStart"/>
+      <w:r>
+        <w:rPr>
+          <w:rFonts w:ascii="Garamond" w:hAnsi="Garamond" w:cs="Tahoma"/>
+          <w:sz w:val="24"/>
+          <w:szCs w:val="24"/>
+        </w:rPr>
+        <w:t>primarily</w:t>
+      </w:r>
+      <w:proofErr w:type="spellEnd"/>
+      <w:r>
+        <w:rPr>
+          <w:rFonts w:ascii="Garamond" w:hAnsi="Garamond" w:cs="Tahoma"/>
+          <w:sz w:val="24"/>
+          <w:szCs w:val="24"/>
+        </w:rPr>
+        <w:t xml:space="preserve"> </w:t>
+      </w:r>
+      <w:proofErr w:type="spellStart"/>
+      <w:r>
+        <w:rPr>
+          <w:rFonts w:ascii="Garamond" w:hAnsi="Garamond" w:cs="Tahoma"/>
+          <w:sz w:val="24"/>
+          <w:szCs w:val="24"/>
+        </w:rPr>
+        <w:t>by</w:t>
+      </w:r>
+      <w:proofErr w:type="spellEnd"/>
+      <w:r>
+        <w:rPr>
+          <w:rFonts w:ascii="Garamond" w:hAnsi="Garamond" w:cs="Tahoma"/>
+          <w:sz w:val="24"/>
+          <w:szCs w:val="24"/>
+        </w:rPr>
+        <w:t xml:space="preserve"> </w:t>
+      </w:r>
+      <w:proofErr w:type="spellStart"/>
+      <w:r>
+        <w:rPr>
+          <w:rFonts w:ascii="Garamond" w:hAnsi="Garamond" w:cs="Tahoma"/>
+          <w:sz w:val="24"/>
+          <w:szCs w:val="24"/>
+        </w:rPr>
+        <w:t>the</w:t>
+      </w:r>
+      <w:proofErr w:type="spellEnd"/>
+      <w:r>
+        <w:rPr>
+          <w:rFonts w:ascii="Garamond" w:hAnsi="Garamond" w:cs="Tahoma"/>
+          <w:sz w:val="24"/>
+          <w:szCs w:val="24"/>
+        </w:rPr>
+        <w:t xml:space="preserve"> </w:t>
+      </w:r>
+      <w:proofErr w:type="spellStart"/>
+      <w:r>
+        <w:rPr>
+          <w:rFonts w:ascii="Garamond" w:hAnsi="Garamond" w:cs="Tahoma"/>
+          <w:sz w:val="24"/>
+          <w:szCs w:val="24"/>
+        </w:rPr>
+        <w:t>relative</w:t>
+      </w:r>
+      <w:proofErr w:type="spellEnd"/>
+      <w:r>
+        <w:rPr>
+          <w:rFonts w:ascii="Garamond" w:hAnsi="Garamond" w:cs="Tahoma"/>
+          <w:sz w:val="24"/>
+          <w:szCs w:val="24"/>
+        </w:rPr>
+        <w:t xml:space="preserve"> </w:t>
+      </w:r>
+      <w:proofErr w:type="spellStart"/>
+      <w:r>
+        <w:rPr>
+          <w:rFonts w:ascii="Garamond" w:hAnsi="Garamond" w:cs="Tahoma"/>
+          <w:sz w:val="24"/>
+          <w:szCs w:val="24"/>
+        </w:rPr>
+        <w:t>price</w:t>
+      </w:r>
+      <w:proofErr w:type="spellEnd"/>
+      <w:r>
+        <w:rPr>
+          <w:rFonts w:ascii="Garamond" w:hAnsi="Garamond" w:cs="Tahoma"/>
+          <w:sz w:val="24"/>
+          <w:szCs w:val="24"/>
+        </w:rPr>
+        <w:t xml:space="preserve"> </w:t>
+      </w:r>
+      <w:proofErr w:type="spellStart"/>
+      <w:r>
+        <w:rPr>
+          <w:rFonts w:ascii="Garamond" w:hAnsi="Garamond" w:cs="Tahoma"/>
+          <w:sz w:val="24"/>
+          <w:szCs w:val="24"/>
+        </w:rPr>
+        <w:t>of</w:t>
+      </w:r>
+      <w:proofErr w:type="spellEnd"/>
+      <w:r>
+        <w:rPr>
+          <w:rFonts w:ascii="Garamond" w:hAnsi="Garamond" w:cs="Tahoma"/>
+          <w:sz w:val="24"/>
+          <w:szCs w:val="24"/>
+        </w:rPr>
+        <w:t xml:space="preserve"> </w:t>
+      </w:r>
+      <w:proofErr w:type="spellStart"/>
+      <w:r>
+        <w:rPr>
+          <w:rFonts w:ascii="Garamond" w:hAnsi="Garamond" w:cs="Tahoma"/>
+          <w:sz w:val="24"/>
+          <w:szCs w:val="24"/>
+        </w:rPr>
+        <w:t>nutritionally</w:t>
+      </w:r>
+      <w:proofErr w:type="spellEnd"/>
+      <w:r>
+        <w:rPr>
+          <w:rFonts w:ascii="Garamond" w:hAnsi="Garamond" w:cs="Tahoma"/>
+          <w:sz w:val="24"/>
+          <w:szCs w:val="24"/>
+        </w:rPr>
+        <w:t xml:space="preserve"> dense </w:t>
+      </w:r>
+      <w:proofErr w:type="spellStart"/>
+      <w:r>
+        <w:rPr>
+          <w:rFonts w:ascii="Garamond" w:hAnsi="Garamond" w:cs="Tahoma"/>
+          <w:sz w:val="24"/>
+          <w:szCs w:val="24"/>
+        </w:rPr>
+        <w:t>foods</w:t>
+      </w:r>
+      <w:proofErr w:type="spellEnd"/>
+      <w:r>
+        <w:rPr>
+          <w:rFonts w:ascii="Garamond" w:hAnsi="Garamond" w:cs="Tahoma"/>
+          <w:sz w:val="24"/>
+          <w:szCs w:val="24"/>
+        </w:rPr>
+        <w:t xml:space="preserve">, </w:t>
+      </w:r>
+      <w:proofErr w:type="spellStart"/>
+      <w:r>
+        <w:rPr>
+          <w:rFonts w:ascii="Garamond" w:hAnsi="Garamond" w:cs="Tahoma"/>
+          <w:sz w:val="24"/>
+          <w:szCs w:val="24"/>
+        </w:rPr>
+        <w:t>dairy</w:t>
+      </w:r>
+      <w:proofErr w:type="spellEnd"/>
+      <w:r>
+        <w:rPr>
+          <w:rFonts w:ascii="Garamond" w:hAnsi="Garamond" w:cs="Tahoma"/>
+          <w:sz w:val="24"/>
+          <w:szCs w:val="24"/>
+        </w:rPr>
+        <w:t xml:space="preserve"> in particular, </w:t>
+      </w:r>
+      <w:proofErr w:type="spellStart"/>
+      <w:r>
+        <w:rPr>
+          <w:rFonts w:ascii="Garamond" w:hAnsi="Garamond" w:cs="Tahoma"/>
+          <w:sz w:val="24"/>
+          <w:szCs w:val="24"/>
+        </w:rPr>
+        <w:t>rather</w:t>
+      </w:r>
+      <w:proofErr w:type="spellEnd"/>
+      <w:r>
+        <w:rPr>
+          <w:rFonts w:ascii="Garamond" w:hAnsi="Garamond" w:cs="Tahoma"/>
+          <w:sz w:val="24"/>
+          <w:szCs w:val="24"/>
+        </w:rPr>
+        <w:t xml:space="preserve"> </w:t>
+      </w:r>
+      <w:proofErr w:type="spellStart"/>
+      <w:r>
+        <w:rPr>
+          <w:rFonts w:ascii="Garamond" w:hAnsi="Garamond" w:cs="Tahoma"/>
+          <w:sz w:val="24"/>
+          <w:szCs w:val="24"/>
+        </w:rPr>
+        <w:t>than</w:t>
+      </w:r>
+      <w:proofErr w:type="spellEnd"/>
+      <w:r>
+        <w:rPr>
+          <w:rFonts w:ascii="Garamond" w:hAnsi="Garamond" w:cs="Tahoma"/>
+          <w:sz w:val="24"/>
+          <w:szCs w:val="24"/>
+        </w:rPr>
+        <w:t xml:space="preserve"> </w:t>
+      </w:r>
+      <w:proofErr w:type="spellStart"/>
+      <w:r>
+        <w:rPr>
+          <w:rFonts w:ascii="Garamond" w:hAnsi="Garamond" w:cs="Tahoma"/>
+          <w:sz w:val="24"/>
+          <w:szCs w:val="24"/>
+        </w:rPr>
+        <w:t>by</w:t>
+      </w:r>
+      <w:proofErr w:type="spellEnd"/>
+      <w:r>
+        <w:rPr>
+          <w:rFonts w:ascii="Garamond" w:hAnsi="Garamond" w:cs="Tahoma"/>
+          <w:sz w:val="24"/>
+          <w:szCs w:val="24"/>
+        </w:rPr>
+        <w:t xml:space="preserve"> </w:t>
+      </w:r>
+      <w:proofErr w:type="spellStart"/>
+      <w:r>
+        <w:rPr>
+          <w:rFonts w:ascii="Garamond" w:hAnsi="Garamond" w:cs="Tahoma"/>
+          <w:sz w:val="24"/>
+          <w:szCs w:val="24"/>
+        </w:rPr>
+        <w:t>the</w:t>
+      </w:r>
+      <w:proofErr w:type="spellEnd"/>
+      <w:r>
+        <w:rPr>
+          <w:rFonts w:ascii="Garamond" w:hAnsi="Garamond" w:cs="Tahoma"/>
+          <w:sz w:val="24"/>
+          <w:szCs w:val="24"/>
+        </w:rPr>
+        <w:t xml:space="preserve"> </w:t>
+      </w:r>
+      <w:proofErr w:type="spellStart"/>
+      <w:r>
+        <w:rPr>
+          <w:rFonts w:ascii="Garamond" w:hAnsi="Garamond" w:cs="Tahoma"/>
+          <w:sz w:val="24"/>
+          <w:szCs w:val="24"/>
+        </w:rPr>
+        <w:t>volume</w:t>
+      </w:r>
+      <w:proofErr w:type="spellEnd"/>
+      <w:r>
+        <w:rPr>
+          <w:rFonts w:ascii="Garamond" w:hAnsi="Garamond" w:cs="Tahoma"/>
+          <w:sz w:val="24"/>
+          <w:szCs w:val="24"/>
+        </w:rPr>
+        <w:t xml:space="preserve"> </w:t>
+      </w:r>
+      <w:proofErr w:type="spellStart"/>
+      <w:r>
+        <w:rPr>
+          <w:rFonts w:ascii="Garamond" w:hAnsi="Garamond" w:cs="Tahoma"/>
+          <w:sz w:val="24"/>
+          <w:szCs w:val="24"/>
+        </w:rPr>
+        <w:t>of</w:t>
+      </w:r>
+      <w:proofErr w:type="spellEnd"/>
+      <w:r>
+        <w:rPr>
+          <w:rFonts w:ascii="Garamond" w:hAnsi="Garamond" w:cs="Tahoma"/>
+          <w:sz w:val="24"/>
+          <w:szCs w:val="24"/>
+        </w:rPr>
+        <w:t xml:space="preserve"> </w:t>
+      </w:r>
+      <w:proofErr w:type="spellStart"/>
+      <w:r>
+        <w:rPr>
+          <w:rFonts w:ascii="Garamond" w:hAnsi="Garamond" w:cs="Tahoma"/>
+          <w:sz w:val="24"/>
+          <w:szCs w:val="24"/>
+        </w:rPr>
+        <w:t>servings</w:t>
+      </w:r>
+      <w:proofErr w:type="spellEnd"/>
+      <w:r>
+        <w:rPr>
+          <w:rFonts w:ascii="Garamond" w:hAnsi="Garamond" w:cs="Tahoma"/>
+          <w:sz w:val="24"/>
+          <w:szCs w:val="24"/>
+        </w:rPr>
+        <w:t>.</w:t>
       </w:r>
     </w:p>
     <w:p>
@@ -2203,7 +2616,7 @@
                     </pic:cNvPicPr>
                   </pic:nvPicPr>
                   <pic:blipFill>
-                    <a:blip r:embed="rId13" cstate="print">
+                    <a:blip r:embed="rId12" cstate="print">
                       <a:extLst>
                         <a:ext uri="{28A0092B-C50C-407E-A947-70E740481C1C}">
                           <a14:useLocalDpi xmlns:a14="http://schemas.microsoft.com/office/drawing/2010/main" val="0"/>
@@ -2240,301 +2653,197 @@
         <w:jc w:val="both"/>
         <w:rPr>
           <w:rFonts w:ascii="Garamond" w:hAnsi="Garamond" w:cs="Tahoma"/>
+          <w:sz w:val="24"/>
+          <w:szCs w:val="24"/>
+          <w:lang w:val="en-US"/>
+        </w:rPr>
+      </w:pPr>
+      <w:r>
+        <w:rPr>
+          <w:rFonts w:ascii="Garamond" w:hAnsi="Garamond" w:cs="Tahoma"/>
+          <w:sz w:val="24"/>
+          <w:szCs w:val="24"/>
+          <w:lang w:val="en-US"/>
+        </w:rPr>
+        <w:lastRenderedPageBreak/>
+        <w:t>Figure \ref{</w:t>
+      </w:r>
+      <w:proofErr w:type="spellStart"/>
+      <w:proofErr w:type="gramStart"/>
+      <w:r>
+        <w:rPr>
+          <w:rFonts w:ascii="Garamond" w:hAnsi="Garamond" w:cs="Tahoma"/>
+          <w:sz w:val="24"/>
+          <w:szCs w:val="24"/>
+          <w:lang w:val="en-US"/>
+        </w:rPr>
+        <w:t>fig:cord</w:t>
+      </w:r>
+      <w:proofErr w:type="gramEnd"/>
+      <w:r>
+        <w:rPr>
+          <w:rFonts w:ascii="Garamond" w:hAnsi="Garamond" w:cs="Tahoma"/>
+          <w:sz w:val="24"/>
+          <w:szCs w:val="24"/>
+          <w:lang w:val="en-US"/>
+        </w:rPr>
+        <w:t>_adequacy</w:t>
+      </w:r>
+      <w:proofErr w:type="spellEnd"/>
+      <w:r>
+        <w:rPr>
+          <w:rFonts w:ascii="Garamond" w:hAnsi="Garamond" w:cs="Tahoma"/>
+          <w:sz w:val="24"/>
+          <w:szCs w:val="24"/>
+          <w:lang w:val="en-US"/>
+        </w:rPr>
+        <w:t xml:space="preserve">} present </w:t>
+      </w:r>
+      <w:proofErr w:type="spellStart"/>
+      <w:r>
+        <w:rPr>
+          <w:rFonts w:ascii="Garamond" w:hAnsi="Garamond" w:cs="Tahoma"/>
+          <w:sz w:val="24"/>
+          <w:szCs w:val="24"/>
+          <w:lang w:val="en-US"/>
+        </w:rPr>
+        <w:t>CoRD's</w:t>
+      </w:r>
+      <w:proofErr w:type="spellEnd"/>
+      <w:r>
+        <w:rPr>
+          <w:rFonts w:ascii="Garamond" w:hAnsi="Garamond" w:cs="Tahoma"/>
+          <w:sz w:val="24"/>
+          <w:szCs w:val="24"/>
+          <w:lang w:val="en-US"/>
+        </w:rPr>
+        <w:t xml:space="preserve"> nutritional adequacy relative to </w:t>
+      </w:r>
+      <w:proofErr w:type="spellStart"/>
+      <w:r>
+        <w:rPr>
+          <w:rFonts w:ascii="Garamond" w:hAnsi="Garamond" w:cs="Tahoma"/>
+          <w:sz w:val="24"/>
+          <w:szCs w:val="24"/>
+          <w:lang w:val="en-US"/>
+        </w:rPr>
+        <w:t>CoNA's</w:t>
+      </w:r>
+      <w:proofErr w:type="spellEnd"/>
+      <w:r>
+        <w:rPr>
+          <w:rFonts w:ascii="Garamond" w:hAnsi="Garamond" w:cs="Tahoma"/>
+          <w:sz w:val="24"/>
+          <w:szCs w:val="24"/>
+          <w:lang w:val="en-US"/>
+        </w:rPr>
+        <w:t xml:space="preserve"> minimum requirements\footnote{Sodium is excluded from this analysis, as its </w:t>
+      </w:r>
+      <w:proofErr w:type="spellStart"/>
+      <w:r>
+        <w:rPr>
+          <w:rFonts w:ascii="Garamond" w:hAnsi="Garamond" w:cs="Tahoma"/>
+          <w:sz w:val="24"/>
+          <w:szCs w:val="24"/>
+          <w:lang w:val="en-US"/>
+        </w:rPr>
+        <w:t>CoNA</w:t>
+      </w:r>
+      <w:proofErr w:type="spellEnd"/>
+      <w:r>
+        <w:rPr>
+          <w:rFonts w:ascii="Garamond" w:hAnsi="Garamond" w:cs="Tahoma"/>
+          <w:sz w:val="24"/>
+          <w:szCs w:val="24"/>
+          <w:lang w:val="en-US"/>
+        </w:rPr>
+        <w:t xml:space="preserve"> constraint operates as maximum rather than a minimum; </w:t>
+      </w:r>
+      <w:proofErr w:type="spellStart"/>
+      <w:r>
+        <w:rPr>
+          <w:rFonts w:ascii="Garamond" w:hAnsi="Garamond" w:cs="Tahoma"/>
+          <w:sz w:val="24"/>
+          <w:szCs w:val="24"/>
+          <w:lang w:val="en-US"/>
+        </w:rPr>
+        <w:t>CoRD</w:t>
+      </w:r>
+      <w:proofErr w:type="spellEnd"/>
+      <w:r>
+        <w:rPr>
+          <w:rFonts w:ascii="Garamond" w:hAnsi="Garamond" w:cs="Tahoma"/>
+          <w:sz w:val="24"/>
+          <w:szCs w:val="24"/>
+          <w:lang w:val="en-US"/>
+        </w:rPr>
+        <w:t xml:space="preserve"> values below this threshold are therefore desirable, not deficient}. Most nutrient-member-month combinations fall within the safe intake range, between the recommended minimum and the tolerable upper limit, with shares ranging from 74.1\% to 90.2\%. Observations below the minimum are modest (0.7\% - 4.8\/), while exceedances of the upper limit are more frequent, ranging from 8.7\% to 21.9\%, driven mainly by niacin and carbohydrates.</w:t>
+      </w:r>
+    </w:p>
+    <w:p>
+      <w:pPr>
+        <w:pStyle w:val="Prrafodelista"/>
+        <w:ind w:left="1080"/>
+        <w:jc w:val="both"/>
+        <w:rPr>
+          <w:rFonts w:ascii="Garamond" w:hAnsi="Garamond" w:cs="Tahoma"/>
           <w:b/>
-          <w:color w:val="FF0000"/>
-          <w:sz w:val="28"/>
-          <w:szCs w:val="28"/>
-        </w:rPr>
-      </w:pPr>
-      <w:r>
-        <w:rPr>
-          <w:rFonts w:ascii="Garamond" w:hAnsi="Garamond" w:cs="Tahoma"/>
-          <w:b/>
-          <w:color w:val="FF0000"/>
-          <w:sz w:val="28"/>
-          <w:szCs w:val="28"/>
-        </w:rPr>
-        <w:t>[</w:t>
-      </w:r>
-      <w:r>
-        <w:rPr>
-          <w:rFonts w:ascii="Garamond" w:hAnsi="Garamond" w:cs="Tahoma"/>
-          <w:b/>
-          <w:color w:val="FF0000"/>
-          <w:sz w:val="28"/>
-          <w:szCs w:val="28"/>
-        </w:rPr>
-        <w:t>ESTO SE VA AL APÉNDICE</w:t>
-      </w:r>
-      <w:r>
-        <w:rPr>
-          <w:rFonts w:ascii="Garamond" w:hAnsi="Garamond" w:cs="Tahoma"/>
-          <w:b/>
-          <w:color w:val="FF0000"/>
-          <w:sz w:val="28"/>
-          <w:szCs w:val="28"/>
-        </w:rPr>
-        <w:t>]</w:t>
-      </w:r>
-    </w:p>
-    <w:p>
-      <w:pPr>
-        <w:jc w:val="both"/>
-        <w:rPr>
-          <w:rFonts w:ascii="Garamond" w:hAnsi="Garamond" w:cs="Tahoma"/>
-          <w:sz w:val="24"/>
-          <w:szCs w:val="24"/>
-          <w:highlight w:val="yellow"/>
-        </w:rPr>
-      </w:pPr>
-      <w:r>
-        <w:rPr>
-          <w:rFonts w:ascii="Garamond" w:hAnsi="Garamond" w:cs="Tahoma"/>
-          <w:sz w:val="24"/>
-          <w:szCs w:val="24"/>
-        </w:rPr>
-        <w:t>Las Figuras 2C(</w:t>
-      </w:r>
-      <w:proofErr w:type="spellStart"/>
-      <w:r>
-        <w:rPr>
-          <w:rFonts w:ascii="Garamond" w:hAnsi="Garamond" w:cs="Tahoma"/>
-          <w:sz w:val="24"/>
-          <w:szCs w:val="24"/>
-        </w:rPr>
-        <w:t>iii</w:t>
-      </w:r>
-      <w:proofErr w:type="spellEnd"/>
-      <w:r>
-        <w:rPr>
-          <w:rFonts w:ascii="Garamond" w:hAnsi="Garamond" w:cs="Tahoma"/>
-          <w:sz w:val="24"/>
-          <w:szCs w:val="24"/>
-        </w:rPr>
-        <w:t>) y 2C(</w:t>
-      </w:r>
-      <w:proofErr w:type="spellStart"/>
-      <w:r>
-        <w:rPr>
-          <w:rFonts w:ascii="Garamond" w:hAnsi="Garamond" w:cs="Tahoma"/>
-          <w:sz w:val="24"/>
-          <w:szCs w:val="24"/>
-        </w:rPr>
-        <w:t>iv</w:t>
-      </w:r>
-      <w:proofErr w:type="spellEnd"/>
-      <w:r>
-        <w:rPr>
-          <w:rFonts w:ascii="Garamond" w:hAnsi="Garamond" w:cs="Tahoma"/>
-          <w:sz w:val="24"/>
-          <w:szCs w:val="24"/>
-        </w:rPr>
-        <w:t xml:space="preserve">), junto con la Tabla A3 del Apéndice, presentan la adecuación nutricional de la </w:t>
-      </w:r>
-      <w:proofErr w:type="spellStart"/>
-      <w:r>
-        <w:rPr>
-          <w:rFonts w:ascii="Garamond" w:hAnsi="Garamond" w:cs="Tahoma"/>
-          <w:sz w:val="24"/>
-          <w:szCs w:val="24"/>
-        </w:rPr>
-        <w:t>CoRD</w:t>
-      </w:r>
-      <w:proofErr w:type="spellEnd"/>
-      <w:r>
-        <w:rPr>
-          <w:rFonts w:ascii="Garamond" w:hAnsi="Garamond" w:cs="Tahoma"/>
-          <w:sz w:val="24"/>
-          <w:szCs w:val="24"/>
-        </w:rPr>
-        <w:t xml:space="preserve"> respecto a los requerimientos mínimos establecidos por el </w:t>
-      </w:r>
-      <w:proofErr w:type="spellStart"/>
-      <w:r>
-        <w:rPr>
-          <w:rFonts w:ascii="Garamond" w:hAnsi="Garamond" w:cs="Tahoma"/>
-          <w:sz w:val="24"/>
-          <w:szCs w:val="24"/>
-        </w:rPr>
-        <w:t>CoNA</w:t>
-      </w:r>
-      <w:proofErr w:type="spellEnd"/>
-      <w:r>
-        <w:rPr>
-          <w:rStyle w:val="Refdenotaalpie"/>
-          <w:rFonts w:ascii="Garamond" w:hAnsi="Garamond" w:cs="Tahoma"/>
-          <w:sz w:val="24"/>
-          <w:szCs w:val="24"/>
-        </w:rPr>
-        <w:footnoteReference w:id="1"/>
-      </w:r>
-      <w:r>
-        <w:rPr>
-          <w:rFonts w:ascii="Garamond" w:hAnsi="Garamond" w:cs="Tahoma"/>
-          <w:sz w:val="24"/>
-          <w:szCs w:val="24"/>
-        </w:rPr>
-        <w:t xml:space="preserve">. </w:t>
-      </w:r>
-      <w:r>
-        <w:rPr>
-          <w:rFonts w:ascii="Garamond" w:hAnsi="Garamond" w:cs="Tahoma"/>
-          <w:sz w:val="24"/>
-          <w:szCs w:val="24"/>
-        </w:rPr>
-        <w:t>La</w:t>
-      </w:r>
-      <w:r>
-        <w:rPr>
-          <w:rFonts w:ascii="Garamond" w:hAnsi="Garamond" w:cs="Tahoma"/>
-          <w:sz w:val="24"/>
-          <w:szCs w:val="24"/>
-        </w:rPr>
-        <w:t xml:space="preserve"> gran mayoría de las combinaciones nutriente-miembro-mes se sitúan dentro del rango de ingesta seguro — entre el mínimo recomendado y el límite superior tolerable —, con proporciones que oscilan entre el 74,1% y el 90,2% según la ciudad y el año (Figura 2C(</w:t>
-      </w:r>
-      <w:proofErr w:type="spellStart"/>
-      <w:r>
-        <w:rPr>
-          <w:rFonts w:ascii="Garamond" w:hAnsi="Garamond" w:cs="Tahoma"/>
-          <w:sz w:val="24"/>
-          <w:szCs w:val="24"/>
-        </w:rPr>
-        <w:t>iv</w:t>
-      </w:r>
-      <w:proofErr w:type="spellEnd"/>
-      <w:r>
-        <w:rPr>
-          <w:rFonts w:ascii="Garamond" w:hAnsi="Garamond" w:cs="Tahoma"/>
-          <w:sz w:val="24"/>
-          <w:szCs w:val="24"/>
-        </w:rPr>
-        <w:t xml:space="preserve">)). Las observaciones por debajo del mínimo representan una fracción pequeña pero no despreciable (0,7%–4,8%), mientras que las excedencias del límite superior son más frecuentes (8,7%–21,9%), impulsadas principalmente por </w:t>
-      </w:r>
-      <w:proofErr w:type="gramStart"/>
-      <w:r>
-        <w:rPr>
-          <w:rFonts w:ascii="Garamond" w:hAnsi="Garamond" w:cs="Tahoma"/>
-          <w:sz w:val="24"/>
-          <w:szCs w:val="24"/>
-        </w:rPr>
-        <w:t>la</w:t>
-      </w:r>
-      <w:r>
-        <w:rPr>
-          <w:rFonts w:ascii="Garamond" w:hAnsi="Garamond" w:cs="Tahoma"/>
-          <w:sz w:val="24"/>
-          <w:szCs w:val="24"/>
-        </w:rPr>
-        <w:t xml:space="preserve"> </w:t>
-      </w:r>
-      <w:r>
-        <w:rPr>
-          <w:rFonts w:ascii="Garamond" w:hAnsi="Garamond" w:cs="Tahoma"/>
-          <w:sz w:val="24"/>
-          <w:szCs w:val="24"/>
-        </w:rPr>
-        <w:t>niacina</w:t>
-      </w:r>
-      <w:proofErr w:type="gramEnd"/>
-      <w:r>
-        <w:rPr>
-          <w:rFonts w:ascii="Garamond" w:hAnsi="Garamond" w:cs="Tahoma"/>
-          <w:sz w:val="24"/>
-          <w:szCs w:val="24"/>
-        </w:rPr>
-        <w:t xml:space="preserve"> y los carbohidratos.</w:t>
-      </w:r>
-      <w:r>
-        <w:rPr>
-          <w:rFonts w:ascii="Garamond" w:hAnsi="Garamond" w:cs="Tahoma"/>
-          <w:sz w:val="24"/>
-          <w:szCs w:val="24"/>
-        </w:rPr>
-        <w:t xml:space="preserve"> </w:t>
-      </w:r>
-      <w:r>
-        <w:rPr>
-          <w:rFonts w:ascii="Garamond" w:hAnsi="Garamond" w:cs="Tahoma"/>
-          <w:sz w:val="24"/>
-          <w:szCs w:val="24"/>
-        </w:rPr>
-        <w:t xml:space="preserve">La vitamina C es el único nutriente con </w:t>
-      </w:r>
-      <w:r>
-        <w:rPr>
-          <w:rFonts w:ascii="Garamond" w:hAnsi="Garamond" w:cs="Tahoma"/>
-          <w:sz w:val="24"/>
-          <w:szCs w:val="24"/>
-        </w:rPr>
-        <w:lastRenderedPageBreak/>
-        <w:t>incumplimiento sistemático del mínimo en las tres ciudades: Bogotá y Cali presentan incumplimientos en 72 y 78 observaciones respectivamente, mientras que Medellín registra 146, resultado consistente con la selección de frutas de bajo contenido en vitamina C en esas ciudades — bananos, moras y tomate de árbol (18–29 mg/100g) — frente a las guayabas seleccionadas en Bogotá (217 mg/100g)</w:t>
-      </w:r>
-      <w:r>
-        <w:rPr>
-          <w:rFonts w:ascii="Garamond" w:hAnsi="Garamond" w:cs="Tahoma"/>
-          <w:sz w:val="24"/>
-          <w:szCs w:val="24"/>
-        </w:rPr>
-        <w:t xml:space="preserve"> </w:t>
-      </w:r>
-      <w:r>
-        <w:rPr>
-          <w:rFonts w:ascii="Garamond" w:hAnsi="Garamond" w:cs="Tahoma"/>
-          <w:sz w:val="24"/>
-          <w:szCs w:val="24"/>
-          <w:highlight w:val="yellow"/>
-        </w:rPr>
-        <w:t>(Añadir una tabla al anexo de los alimentos seleccionados)</w:t>
-      </w:r>
-    </w:p>
-    <w:p>
-      <w:pPr>
-        <w:pStyle w:val="Prrafodelista"/>
+          <w:sz w:val="28"/>
+          <w:szCs w:val="28"/>
+          <w:lang w:val="en-US"/>
+        </w:rPr>
+      </w:pPr>
+    </w:p>
+    <w:p>
+      <w:pPr>
+        <w:pStyle w:val="font-claude-response-body"/>
         <w:numPr>
           <w:ilvl w:val="1"/>
           <w:numId w:val="1"/>
         </w:numPr>
-        <w:jc w:val="both"/>
-        <w:rPr>
-          <w:rFonts w:ascii="Garamond" w:hAnsi="Garamond" w:cs="Tahoma"/>
+        <w:rPr>
           <w:b/>
           <w:sz w:val="28"/>
           <w:szCs w:val="28"/>
-        </w:rPr>
-      </w:pPr>
-      <w:r>
-        <w:rPr>
-          <w:rFonts w:ascii="Garamond" w:hAnsi="Garamond" w:cs="Tahoma"/>
+          <w:lang w:val="en-US"/>
+        </w:rPr>
+      </w:pPr>
+      <w:r>
+        <w:rPr>
           <w:b/>
           <w:sz w:val="28"/>
           <w:szCs w:val="28"/>
-        </w:rPr>
-        <w:t>Elasticidad de precios sombra</w:t>
-      </w:r>
-    </w:p>
-    <w:p>
-      <w:pPr>
-        <w:jc w:val="both"/>
-        <w:rPr>
-          <w:rFonts w:ascii="Garamond" w:hAnsi="Garamond" w:cs="Tahoma"/>
-          <w:sz w:val="24"/>
-          <w:szCs w:val="24"/>
-        </w:rPr>
-      </w:pPr>
-      <w:r>
-        <w:rPr>
-          <w:rFonts w:ascii="Garamond" w:hAnsi="Garamond" w:cs="Tahoma"/>
-          <w:sz w:val="24"/>
-          <w:szCs w:val="24"/>
-        </w:rPr>
-        <w:t xml:space="preserve">Los modelos de programación lineal del </w:t>
-      </w:r>
-      <w:proofErr w:type="spellStart"/>
-      <w:r>
-        <w:rPr>
-          <w:rFonts w:ascii="Garamond" w:hAnsi="Garamond" w:cs="Tahoma"/>
-          <w:sz w:val="24"/>
-          <w:szCs w:val="24"/>
+          <w:lang w:val="en-US"/>
+        </w:rPr>
+        <w:t>Limiting Nutrients and Their Shadow Prices in the Least-Cost Diet</w:t>
+      </w:r>
+    </w:p>
+    <w:p>
+      <w:pPr>
+        <w:jc w:val="both"/>
+        <w:rPr>
+          <w:rFonts w:ascii="Garamond" w:hAnsi="Garamond" w:cs="Tahoma"/>
+          <w:sz w:val="24"/>
+          <w:szCs w:val="24"/>
+          <w:lang w:val="en-US"/>
+        </w:rPr>
+      </w:pPr>
+      <w:r>
+        <w:rPr>
+          <w:rFonts w:ascii="Garamond" w:hAnsi="Garamond" w:cs="Tahoma"/>
+          <w:sz w:val="24"/>
+          <w:szCs w:val="24"/>
+          <w:lang w:val="en-US"/>
+        </w:rPr>
+        <w:t xml:space="preserve">The </w:t>
+      </w:r>
+      <w:proofErr w:type="spellStart"/>
+      <w:r>
+        <w:rPr>
+          <w:rFonts w:ascii="Garamond" w:hAnsi="Garamond" w:cs="Tahoma"/>
+          <w:sz w:val="24"/>
+          <w:szCs w:val="24"/>
+          <w:lang w:val="en-US"/>
         </w:rPr>
         <w:t>CoNA</w:t>
       </w:r>
@@ -2544,170 +2853,20 @@
           <w:rFonts w:ascii="Garamond" w:hAnsi="Garamond" w:cs="Tahoma"/>
           <w:sz w:val="24"/>
           <w:szCs w:val="24"/>
-        </w:rPr>
-        <w:t xml:space="preserve"> no solo produce un costo mínimo; sino que genera también información sobre cuáles nutrientes constituyen los cuellos de botella de la dieta óptima. La Figura 3 y la Tabla 2 presentan la frecuencia de </w:t>
-      </w:r>
-      <w:r>
-        <w:rPr>
-          <w:rFonts w:ascii="Garamond" w:hAnsi="Garamond" w:cs="Tahoma"/>
-          <w:sz w:val="24"/>
-          <w:szCs w:val="24"/>
-        </w:rPr>
-        <w:t>nutrientes limitantes</w:t>
-      </w:r>
-      <w:r>
-        <w:rPr>
-          <w:rFonts w:ascii="Garamond" w:hAnsi="Garamond" w:cs="Tahoma"/>
-          <w:sz w:val="24"/>
-          <w:szCs w:val="24"/>
-        </w:rPr>
-        <w:t xml:space="preserve"> y los SPE medios por nutriente, ciudad y miembro del hogar durante el período 2019–2024</w:t>
-      </w:r>
-      <w:r>
-        <w:rPr>
-          <w:rFonts w:ascii="Garamond" w:hAnsi="Garamond" w:cs="Tahoma"/>
-          <w:sz w:val="24"/>
-          <w:szCs w:val="24"/>
-        </w:rPr>
-        <w:t>, respectivamente.</w:t>
-      </w:r>
-      <w:r>
-        <w:rPr>
-          <w:rFonts w:ascii="Garamond" w:hAnsi="Garamond" w:cs="Tahoma"/>
-          <w:sz w:val="24"/>
-          <w:szCs w:val="24"/>
-        </w:rPr>
-        <w:t xml:space="preserve"> </w:t>
-      </w:r>
-      <w:r>
-        <w:rPr>
-          <w:rFonts w:ascii="Garamond" w:hAnsi="Garamond" w:cs="Tahoma"/>
-          <w:sz w:val="24"/>
-          <w:szCs w:val="24"/>
-        </w:rPr>
-        <w:t>La Figura 3, la Figura 4 y la Tabla 2 presentan la frecuencia de vinculación y los SPE del lado mínimo por nutriente, ciudad y miembro del hogar durante el período 2019–2024.</w:t>
-      </w:r>
-      <w:r>
-        <w:rPr>
-          <w:rFonts w:ascii="Garamond" w:hAnsi="Garamond" w:cs="Tahoma"/>
-          <w:sz w:val="24"/>
-          <w:szCs w:val="24"/>
-        </w:rPr>
-        <w:t xml:space="preserve"> </w:t>
-      </w:r>
-      <w:r>
-        <w:rPr>
-          <w:rFonts w:ascii="Garamond" w:hAnsi="Garamond" w:cs="Tahoma"/>
-          <w:sz w:val="24"/>
-          <w:szCs w:val="24"/>
-        </w:rPr>
-        <w:t xml:space="preserve">Tres nutrientes son vinculantes en el 100% de los meses en las tres ciudades: calcio, sodio y vitamina C. </w:t>
-      </w:r>
-    </w:p>
-    <w:p>
-      <w:pPr>
-        <w:jc w:val="both"/>
-        <w:rPr>
-          <w:rFonts w:ascii="Garamond" w:hAnsi="Garamond" w:cs="Tahoma"/>
-          <w:sz w:val="24"/>
-          <w:szCs w:val="24"/>
-        </w:rPr>
-      </w:pPr>
-      <w:r>
-        <w:rPr>
-          <w:rFonts w:ascii="Garamond" w:hAnsi="Garamond" w:cs="Tahoma"/>
-          <w:sz w:val="24"/>
-          <w:szCs w:val="24"/>
-        </w:rPr>
-        <w:t>El sodio merece una aclaración metodológica: aunque las preocupaciones nutricionales sobre este mineral se asocian típicamente al exceso y no a la deficiencia, el modelo incorpora un requerimiento mínimo de 1500 mg/día correspondiente al nivel de ingesta adecuada (</w:t>
-      </w:r>
-      <w:proofErr w:type="spellStart"/>
-      <w:r>
-        <w:rPr>
-          <w:rFonts w:ascii="Garamond" w:hAnsi="Garamond" w:cs="Tahoma"/>
-          <w:sz w:val="24"/>
-          <w:szCs w:val="24"/>
-        </w:rPr>
-        <w:t>Adequate</w:t>
-      </w:r>
-      <w:proofErr w:type="spellEnd"/>
-      <w:r>
-        <w:rPr>
-          <w:rFonts w:ascii="Garamond" w:hAnsi="Garamond" w:cs="Tahoma"/>
-          <w:sz w:val="24"/>
-          <w:szCs w:val="24"/>
-        </w:rPr>
-        <w:t xml:space="preserve"> </w:t>
-      </w:r>
-      <w:proofErr w:type="spellStart"/>
-      <w:r>
-        <w:rPr>
-          <w:rFonts w:ascii="Garamond" w:hAnsi="Garamond" w:cs="Tahoma"/>
-          <w:sz w:val="24"/>
-          <w:szCs w:val="24"/>
-        </w:rPr>
-        <w:t>Intake</w:t>
-      </w:r>
-      <w:proofErr w:type="spellEnd"/>
-      <w:r>
-        <w:rPr>
-          <w:rFonts w:ascii="Garamond" w:hAnsi="Garamond" w:cs="Tahoma"/>
-          <w:sz w:val="24"/>
-          <w:szCs w:val="24"/>
-        </w:rPr>
-        <w:t>), que el programa lineal satisface seleccionando sal en cantidades precisas — el único alimento con densidad de sodio suficiente para complementar el aporte del resto de la cesta a costo mínimo. Sin embargo, dado que el precio relativo de la sal en los mercados urbanos colombianos es muy bajo, el SPE del sodio es el más pequeño del sistema (≈ 0,001), lo que lo hace económicamente irrelevante para el análisis.</w:t>
-      </w:r>
-    </w:p>
-    <w:p>
-      <w:pPr>
-        <w:jc w:val="both"/>
-        <w:rPr>
-          <w:rFonts w:ascii="Garamond" w:hAnsi="Garamond" w:cs="Tahoma"/>
-          <w:sz w:val="24"/>
-          <w:szCs w:val="24"/>
-        </w:rPr>
-      </w:pPr>
-      <w:r>
-        <w:rPr>
-          <w:rFonts w:ascii="Garamond" w:hAnsi="Garamond" w:cs="Tahoma"/>
-          <w:sz w:val="24"/>
-          <w:szCs w:val="24"/>
-        </w:rPr>
-        <w:t xml:space="preserve">El calcio es consistentemente el nutriente de mínimo más oneroso del sistema — vinculante en el 100% de los meses en las tres ciudades y para los tres miembros del hogar — con SPE que oscilan entre 0,337 y 0,523 según la ciudad y el miembro. Para la niña de 10–14 años el SPE de calcio es el más alto (0,486–0,523), mientras que para el adulto masculino el zinc supera al calcio como restricción más costosa en Bogotá y Medellín (0,564 y 0,486 respectivamente), aunque el calcio sigue siendo elevado (0,356). Para la mujer adulta, el calcio es la restricción dominante en las tres ciudades (0,358–0,488), seguida por la vitamina B12 en Cali y Medellín (0,082–0,091). Estos resultados son directamente atribuibles a la estructura de fuentes alimentarias: la leche pasteurizada provee entre el 64% y el 85% del calcio total de la dieta según el miembro y la ciudad, y entre el 97% y el 99% de la vitamina B12 (véase Figura A, Apéndice), de modo que su precio relativo elevado determina que el cumplimiento de estas restricciones sea el principal componente del costo de la adecuación nutricional. </w:t>
-      </w:r>
-      <w:r>
-        <w:rPr>
-          <w:rFonts w:ascii="Garamond" w:hAnsi="Garamond" w:cs="Tahoma"/>
-          <w:sz w:val="24"/>
-          <w:szCs w:val="24"/>
-          <w:highlight w:val="yellow"/>
-        </w:rPr>
-        <w:t>El zinc es el segundo nutriente en importancia económica, con SPE medios de 0,564 en Bogotá, 0,297 en Cali y 0,486 en Medellín. Su aporte proviene principalmente de las leguminosas — arveja seca y lentejas concentran entre el 55% y el 76% del zinc para la mujer adulta y la niña —, aunque el aporte de los cereales es también relevante para el adulto masculino (harina de trigo y harina precocida contribuyen entre el 15% y el 20%).</w:t>
-      </w:r>
-      <w:r>
-        <w:rPr>
-          <w:rFonts w:ascii="Garamond" w:hAnsi="Garamond" w:cs="Tahoma"/>
-          <w:sz w:val="24"/>
-          <w:szCs w:val="24"/>
-        </w:rPr>
-        <w:t xml:space="preserve"> La vitamina C, pese a ser vinculante el 100% de los meses, presenta SPE reducidos (0,042–0,046): en Bogotá y Medellín la guayaba provee entre el 90% y el 94% del total, mientras que en Cali la yuca compite como fuente de magnitud comparable (93%–95% frente a 90%–94% de la guayaba), lo que refleja diferencias en la disponibilidad y precio relativo de estas frutas entre mercados. </w:t>
-      </w:r>
-      <w:r>
-        <w:rPr>
-          <w:rFonts w:ascii="Garamond" w:hAnsi="Garamond" w:cs="Tahoma"/>
-          <w:sz w:val="24"/>
-          <w:szCs w:val="24"/>
-        </w:rPr>
-        <w:t xml:space="preserve">Otros nutrientes como la vitamina A, la proteína, </w:t>
-      </w:r>
+          <w:lang w:val="en-US"/>
+        </w:rPr>
+        <w:t xml:space="preserve"> linear programming model yield not merely a minimum cost but also policy-relevant information on which nutrients act as limiting factors in the optimal diet. A nutrient is said to be limiting in a given month when its minimum requirement binds in the optimal solution. Figure \ref{</w:t>
+      </w:r>
+      <w:proofErr w:type="spellStart"/>
       <w:proofErr w:type="gramStart"/>
       <w:r>
         <w:rPr>
           <w:rFonts w:ascii="Garamond" w:hAnsi="Garamond" w:cs="Tahoma"/>
           <w:sz w:val="24"/>
           <w:szCs w:val="24"/>
-        </w:rPr>
-        <w:t>la niacina</w:t>
+          <w:lang w:val="en-US"/>
+        </w:rPr>
+        <w:t>fig:limiting</w:t>
       </w:r>
       <w:proofErr w:type="gramEnd"/>
       <w:r>
@@ -2715,26 +2874,49 @@
           <w:rFonts w:ascii="Garamond" w:hAnsi="Garamond" w:cs="Tahoma"/>
           <w:sz w:val="24"/>
           <w:szCs w:val="24"/>
-        </w:rPr>
-        <w:t xml:space="preserve"> y el magnesio </w:t>
-      </w:r>
-      <w:r>
-        <w:rPr>
-          <w:rFonts w:ascii="Garamond" w:hAnsi="Garamond" w:cs="Tahoma"/>
-          <w:sz w:val="24"/>
-          <w:szCs w:val="24"/>
-        </w:rPr>
-        <w:lastRenderedPageBreak/>
-        <w:t>son vinculantes con frecuencia variable pero con SPE reducidos (0,004–0,094), lo que indica que su cumplimiento tiene una carga económica moderada o baja.</w:t>
-      </w:r>
-    </w:p>
-    <w:p>
-      <w:pPr>
-        <w:jc w:val="both"/>
-        <w:rPr>
-          <w:rFonts w:ascii="Garamond" w:hAnsi="Garamond" w:cs="Tahoma"/>
-          <w:sz w:val="28"/>
-          <w:szCs w:val="28"/>
+          <w:lang w:val="en-US"/>
+        </w:rPr>
+        <w:t>-nutrients</w:t>
+      </w:r>
+      <w:proofErr w:type="spellEnd"/>
+      <w:r>
+        <w:rPr>
+          <w:rFonts w:ascii="Garamond" w:hAnsi="Garamond" w:cs="Tahoma"/>
+          <w:sz w:val="24"/>
+          <w:szCs w:val="24"/>
+          <w:lang w:val="en-US"/>
+        </w:rPr>
+        <w:t xml:space="preserve">} shows the annual binding frequency of each nutrient, and Figure 5 complements this analysis by tracing the temporal evolution of SPE between 2019 and 2024. Three nutrients are limiting in 100\% of months across all three cities: calcium, </w:t>
+      </w:r>
+      <w:proofErr w:type="spellStart"/>
+      <w:r>
+        <w:rPr>
+          <w:rFonts w:ascii="Garamond" w:hAnsi="Garamond" w:cs="Tahoma"/>
+          <w:sz w:val="24"/>
+          <w:szCs w:val="24"/>
+          <w:lang w:val="en-US"/>
+        </w:rPr>
+        <w:t>soidium</w:t>
+      </w:r>
+      <w:proofErr w:type="spellEnd"/>
+      <w:r>
+        <w:rPr>
+          <w:rFonts w:ascii="Garamond" w:hAnsi="Garamond" w:cs="Tahoma"/>
+          <w:sz w:val="24"/>
+          <w:szCs w:val="24"/>
+          <w:lang w:val="en-US"/>
+        </w:rPr>
+        <w:t>, and vitamin C. However, sodium requires a brief methodological explanation. Although nutritional concerns over this mineral typically center on excess rather than deficiency, the model incorporates a minimum requirement of 1.500 mg/day corresponding to the Adequate Intake level, which the LP satisfies by selecting precise quantities of salt, the only food with sufficient sodium density to complement the rest of the basket at minimum cost. Because the relative price of salt in Colombian urban markets is very low, however, sodium's SPE is the smallest in the system ($\sim$ 0.001), rendering it economically irrelevant for the analysis.</w:t>
+      </w:r>
+    </w:p>
+    <w:p>
+      <w:pPr>
+        <w:jc w:val="center"/>
+        <w:rPr>
+          <w:rFonts w:ascii="Garamond" w:hAnsi="Garamond" w:cs="Tahoma"/>
+          <w:sz w:val="24"/>
+          <w:szCs w:val="24"/>
+          <w:lang w:val="en-US"/>
         </w:rPr>
       </w:pPr>
       <w:r>
@@ -2745,9 +2927,9 @@
           <w:szCs w:val="28"/>
         </w:rPr>
         <w:drawing>
-          <wp:inline distT="0" distB="0" distL="0" distR="0">
-            <wp:extent cx="5840441" cy="3752490"/>
-            <wp:effectExtent l="0" t="0" r="8255" b="635"/>
+          <wp:inline distT="0" distB="0" distL="0" distR="0" wp14:anchorId="26B678AF" wp14:editId="41408A5F">
+            <wp:extent cx="4810125" cy="3090467"/>
+            <wp:effectExtent l="0" t="0" r="0" b="0"/>
             <wp:docPr id="9" name="Imagen 9"/>
             <wp:cNvGraphicFramePr>
               <a:graphicFrameLocks xmlns:a="http://schemas.openxmlformats.org/drawingml/2006/main" noChangeAspect="1"/>
@@ -2757,6 +2939,165 @@
                 <pic:pic xmlns:pic="http://schemas.openxmlformats.org/drawingml/2006/picture">
                   <pic:nvPicPr>
                     <pic:cNvPr id="0" name="Picture 9"/>
+                    <pic:cNvPicPr>
+                      <a:picLocks noChangeAspect="1" noChangeArrowheads="1"/>
+                    </pic:cNvPicPr>
+                  </pic:nvPicPr>
+                  <pic:blipFill>
+                    <a:blip r:embed="rId13" cstate="print">
+                      <a:extLst>
+                        <a:ext uri="{28A0092B-C50C-407E-A947-70E740481C1C}">
+                          <a14:useLocalDpi xmlns:a14="http://schemas.microsoft.com/office/drawing/2010/main" val="0"/>
+                        </a:ext>
+                      </a:extLst>
+                    </a:blip>
+                    <a:srcRect/>
+                    <a:stretch>
+                      <a:fillRect/>
+                    </a:stretch>
+                  </pic:blipFill>
+                  <pic:spPr bwMode="auto">
+                    <a:xfrm>
+                      <a:off x="0" y="0"/>
+                      <a:ext cx="4823477" cy="3099046"/>
+                    </a:xfrm>
+                    <a:prstGeom prst="rect">
+                      <a:avLst/>
+                    </a:prstGeom>
+                    <a:noFill/>
+                    <a:ln>
+                      <a:noFill/>
+                    </a:ln>
+                  </pic:spPr>
+                </pic:pic>
+              </a:graphicData>
+            </a:graphic>
+          </wp:inline>
+        </w:drawing>
+      </w:r>
+    </w:p>
+    <w:p>
+      <w:pPr>
+        <w:jc w:val="both"/>
+        <w:rPr>
+          <w:rFonts w:ascii="Garamond" w:hAnsi="Garamond" w:cs="Tahoma"/>
+          <w:sz w:val="24"/>
+          <w:szCs w:val="24"/>
+          <w:lang w:val="en-US"/>
+        </w:rPr>
+      </w:pPr>
+      <w:r>
+        <w:rPr>
+          <w:rFonts w:ascii="Garamond" w:hAnsi="Garamond" w:cs="Tahoma"/>
+          <w:sz w:val="24"/>
+          <w:szCs w:val="24"/>
+          <w:lang w:val="en-US"/>
+        </w:rPr>
+        <w:lastRenderedPageBreak/>
+        <w:t xml:space="preserve">Calcium is consistently the most expensive constraint to satisfy among minimum-side nutrients in the system, binding in 100\% of months across all three cities and for all three household members, with SPE ranging from 0.337 to 0.523. Its burden is most accurate for the 10- to </w:t>
+      </w:r>
+      <w:proofErr w:type="gramStart"/>
+      <w:r>
+        <w:rPr>
+          <w:rFonts w:ascii="Garamond" w:hAnsi="Garamond" w:cs="Tahoma"/>
+          <w:sz w:val="24"/>
+          <w:szCs w:val="24"/>
+          <w:lang w:val="en-US"/>
+        </w:rPr>
+        <w:t>14 year-old</w:t>
+      </w:r>
+      <w:proofErr w:type="gramEnd"/>
+      <w:r>
+        <w:rPr>
+          <w:rFonts w:ascii="Garamond" w:hAnsi="Garamond" w:cs="Tahoma"/>
+          <w:sz w:val="24"/>
+          <w:szCs w:val="24"/>
+          <w:lang w:val="en-US"/>
+        </w:rPr>
+        <w:t xml:space="preserve"> girl, whose calcium SPE (0.486 - 0.523) is the highest observed for any profile. For the adult male, zinc overtakes calcium as the most expensive constraint in Bogotá and Medellín (0.564 and 0.486, respectively), although calcium remains substantial there as well. Calcium, for the adult female, dominates across all three cities (from 0.358 to 0.488), followed at a considerable distance by vitamin B12 in Cali and Medellín (0.082 - 0.091). This pattern is rooted in the structure of dietary sources: pasteurized milk alone supplies between 64\% and 85\% of total dietary calcium and between 97\% and 99\% of vitamin B12 (see Appendix E). Vitamin C, by contrast, binds in 100\% of months as well, yet its SPE remains modest (from 0.042 - 0.046). In Bogotá and Medellín, guavas supply 90\% - 94\% of total vitamin C; in Cali cassava emerges as a source of comparable importance, a divergence that reflects underlying differences in the availability and relative price of these food items across urban markets. </w:t>
+      </w:r>
+    </w:p>
+    <w:p>
+      <w:pPr>
+        <w:jc w:val="both"/>
+        <w:rPr>
+          <w:rFonts w:ascii="Garamond" w:hAnsi="Garamond" w:cs="Tahoma"/>
+          <w:sz w:val="24"/>
+          <w:szCs w:val="24"/>
+          <w:lang w:val="en-US"/>
+        </w:rPr>
+      </w:pPr>
+      <w:r>
+        <w:rPr>
+          <w:rFonts w:ascii="Garamond" w:hAnsi="Garamond" w:cs="Tahoma"/>
+          <w:sz w:val="24"/>
+          <w:szCs w:val="24"/>
+          <w:lang w:val="en-US"/>
+        </w:rPr>
+        <w:t>Zinc ranks second in overall economic importance, with mean SPE of 0.564 in Bogotá. This implies that a 10\% increase in the minimum zinc requirement would raise the minimum diet cost by 5.64\%, evaluated at the margin. The corresponding values are 0.297 in Cali and 0.486 in Medellín. Its cost is drive primarily by legumes, specifically dried peas and lentils that jointly accounting for 55\% - 76\% of zinc intake for the adult female and the girl, although cereals, chiefly wheat flour and pre-cooked flour, contribute a non-trivial 15\% - 20\% for the adult male. The remaining nutrients that bind with appreciable frequency, as shown in Figure \ref{</w:t>
+      </w:r>
+      <w:proofErr w:type="spellStart"/>
+      <w:proofErr w:type="gramStart"/>
+      <w:r>
+        <w:rPr>
+          <w:rFonts w:ascii="Garamond" w:hAnsi="Garamond" w:cs="Tahoma"/>
+          <w:sz w:val="24"/>
+          <w:szCs w:val="24"/>
+          <w:lang w:val="en-US"/>
+        </w:rPr>
+        <w:t>fig:limiting</w:t>
+      </w:r>
+      <w:proofErr w:type="gramEnd"/>
+      <w:r>
+        <w:rPr>
+          <w:rFonts w:ascii="Garamond" w:hAnsi="Garamond" w:cs="Tahoma"/>
+          <w:sz w:val="24"/>
+          <w:szCs w:val="24"/>
+          <w:lang w:val="en-US"/>
+        </w:rPr>
+        <w:t>-nutrients</w:t>
+      </w:r>
+      <w:proofErr w:type="spellEnd"/>
+      <w:r>
+        <w:rPr>
+          <w:rFonts w:ascii="Garamond" w:hAnsi="Garamond" w:cs="Tahoma"/>
+          <w:sz w:val="24"/>
+          <w:szCs w:val="24"/>
+          <w:lang w:val="en-US"/>
+        </w:rPr>
+        <w:t>}, namely Vitamin A, protein, niacin, and magnesium, carry comparatively modest SPE (0.004 - 0.094), suggesting that their fulfillment imposes only a moderate-to-low economic burden on the optimal diet.</w:t>
+      </w:r>
+    </w:p>
+    <w:p>
+      <w:pPr>
+        <w:jc w:val="center"/>
+        <w:rPr>
+          <w:rFonts w:ascii="Garamond" w:hAnsi="Garamond" w:cs="Tahoma"/>
+          <w:sz w:val="24"/>
+          <w:szCs w:val="24"/>
+          <w:lang w:val="en-US"/>
+        </w:rPr>
+      </w:pPr>
+      <w:r>
+        <w:rPr>
+          <w:rFonts w:ascii="Garamond" w:hAnsi="Garamond" w:cs="Tahoma"/>
+          <w:noProof/>
+          <w:sz w:val="28"/>
+          <w:szCs w:val="28"/>
+        </w:rPr>
+        <w:drawing>
+          <wp:inline distT="0" distB="0" distL="0" distR="0" wp14:anchorId="34433B40" wp14:editId="1244E483">
+            <wp:extent cx="4418718" cy="3060611"/>
+            <wp:effectExtent l="0" t="0" r="1270" b="6985"/>
+            <wp:docPr id="11" name="Imagen 11"/>
+            <wp:cNvGraphicFramePr>
+              <a:graphicFrameLocks xmlns:a="http://schemas.openxmlformats.org/drawingml/2006/main" noChangeAspect="1"/>
+            </wp:cNvGraphicFramePr>
+            <a:graphic xmlns:a="http://schemas.openxmlformats.org/drawingml/2006/main">
+              <a:graphicData uri="http://schemas.openxmlformats.org/drawingml/2006/picture">
+                <pic:pic xmlns:pic="http://schemas.openxmlformats.org/drawingml/2006/picture">
+                  <pic:nvPicPr>
+                    <pic:cNvPr id="0" name="Picture 11"/>
                     <pic:cNvPicPr>
                       <a:picLocks noChangeAspect="1" noChangeArrowheads="1"/>
                     </pic:cNvPicPr>
@@ -2777,7 +3118,7 @@
                   <pic:spPr bwMode="auto">
                     <a:xfrm>
                       <a:off x="0" y="0"/>
-                      <a:ext cx="5851827" cy="3759806"/>
+                      <a:ext cx="4441987" cy="3076728"/>
                     </a:xfrm>
                     <a:prstGeom prst="rect">
                       <a:avLst/>
@@ -2799,85 +3140,59 @@
         <w:jc w:val="both"/>
         <w:rPr>
           <w:rFonts w:ascii="Garamond" w:hAnsi="Garamond" w:cs="Tahoma"/>
-          <w:sz w:val="24"/>
-          <w:szCs w:val="24"/>
-        </w:rPr>
-      </w:pPr>
-      <w:r>
-        <w:rPr>
-          <w:rFonts w:ascii="Garamond" w:hAnsi="Garamond" w:cs="Tahoma"/>
-          <w:sz w:val="24"/>
-          <w:szCs w:val="24"/>
-        </w:rPr>
-        <w:t>La Figura 5 ilustra la evolución temporal de los SPE de mínimo entre 2019 y 2024. El precio sombra del calcio muestra una tendencia creciente en las tres ciudades — de 0,338–0,438 en 2019 a 0,460–0,511 en 2024 —, consistente con el incremento sostenido del precio real de la leche pasteurizada documentado en la subsección 4.2: cuando el alimento que satisface una restricción se encarece relativamente, el precio sombra de esa restricción aumenta. El zinc registra la mayor variabilidad temporal entre los nutrientes de mínimo, con SPE que oscilan entre 0,040 y 0,718 según la ciudad y el año para el adulto masculino, reflejando la dependencia de su costo en el precio relativo de las leguminosas — cuyas fluctuaciones de precio relativo documentadas en la subsección 4.2 se traducen directamente en variaciones en la carga económica de esta restricción. En conjunto, estos resultados indican que el costo de la adecuación nutricional está determinado fundamentalmente por dos restricciones de mínimo: el calcio — oneroso para todos los miembros del hogar y con tendencia creciente — y el zinc — oneroso específicamente para el adulto masculino y altamente variable en el tiempo. La heterogeneidad en los perfiles de restricción entre miembros del hogar subraya que el costo de la adecuación nutricional no es un agregado homogéneo sino el resultado de tensiones nutricionalmente específicas que varían según las características demográficas del hogar.</w:t>
-      </w:r>
-    </w:p>
-    <w:p>
-      <w:pPr>
-        <w:jc w:val="both"/>
-        <w:rPr>
-          <w:rFonts w:ascii="Garamond" w:hAnsi="Garamond" w:cs="Tahoma"/>
-          <w:sz w:val="28"/>
-          <w:szCs w:val="28"/>
-        </w:rPr>
-      </w:pPr>
-      <w:r>
-        <w:rPr>
-          <w:rFonts w:ascii="Garamond" w:hAnsi="Garamond" w:cs="Tahoma"/>
-          <w:noProof/>
-          <w:sz w:val="28"/>
-          <w:szCs w:val="28"/>
+          <w:sz w:val="28"/>
+          <w:szCs w:val="28"/>
+        </w:rPr>
+      </w:pPr>
+    </w:p>
+    <w:p>
+      <w:pPr>
+        <w:jc w:val="both"/>
+        <w:rPr>
+          <w:rFonts w:ascii="Garamond" w:hAnsi="Garamond" w:cs="Tahoma"/>
+          <w:sz w:val="24"/>
+          <w:szCs w:val="24"/>
+          <w:lang w:val="en-US"/>
+        </w:rPr>
+      </w:pPr>
+      <w:r>
+        <w:rPr>
+          <w:rFonts w:ascii="Garamond" w:hAnsi="Garamond" w:cs="Tahoma"/>
+          <w:sz w:val="24"/>
+          <w:szCs w:val="24"/>
+          <w:lang w:val="en-US"/>
         </w:rPr>
         <w:lastRenderedPageBreak/>
-        <w:drawing>
-          <wp:inline distT="0" distB="0" distL="0" distR="0">
-            <wp:extent cx="5246174" cy="3633746"/>
-            <wp:effectExtent l="0" t="0" r="0" b="5080"/>
-            <wp:docPr id="11" name="Imagen 11"/>
-            <wp:cNvGraphicFramePr>
-              <a:graphicFrameLocks xmlns:a="http://schemas.openxmlformats.org/drawingml/2006/main" noChangeAspect="1"/>
-            </wp:cNvGraphicFramePr>
-            <a:graphic xmlns:a="http://schemas.openxmlformats.org/drawingml/2006/main">
-              <a:graphicData uri="http://schemas.openxmlformats.org/drawingml/2006/picture">
-                <pic:pic xmlns:pic="http://schemas.openxmlformats.org/drawingml/2006/picture">
-                  <pic:nvPicPr>
-                    <pic:cNvPr id="0" name="Picture 11"/>
-                    <pic:cNvPicPr>
-                      <a:picLocks noChangeAspect="1" noChangeArrowheads="1"/>
-                    </pic:cNvPicPr>
-                  </pic:nvPicPr>
-                  <pic:blipFill>
-                    <a:blip r:embed="rId15" cstate="print">
-                      <a:extLst>
-                        <a:ext uri="{28A0092B-C50C-407E-A947-70E740481C1C}">
-                          <a14:useLocalDpi xmlns:a14="http://schemas.microsoft.com/office/drawing/2010/main" val="0"/>
-                        </a:ext>
-                      </a:extLst>
-                    </a:blip>
-                    <a:srcRect/>
-                    <a:stretch>
-                      <a:fillRect/>
-                    </a:stretch>
-                  </pic:blipFill>
-                  <pic:spPr bwMode="auto">
-                    <a:xfrm>
-                      <a:off x="0" y="0"/>
-                      <a:ext cx="5250723" cy="3636897"/>
-                    </a:xfrm>
-                    <a:prstGeom prst="rect">
-                      <a:avLst/>
-                    </a:prstGeom>
-                    <a:noFill/>
-                    <a:ln>
-                      <a:noFill/>
-                    </a:ln>
-                  </pic:spPr>
-                </pic:pic>
-              </a:graphicData>
-            </a:graphic>
-          </wp:inline>
-        </w:drawing>
-      </w:r>
+        <w:t>T</w:t>
+      </w:r>
+      <w:r>
+        <w:rPr>
+          <w:rFonts w:ascii="Garamond" w:hAnsi="Garamond" w:cs="Tahoma"/>
+          <w:sz w:val="24"/>
+          <w:szCs w:val="24"/>
+          <w:lang w:val="en-US"/>
+        </w:rPr>
+        <w:t xml:space="preserve">hese </w:t>
+      </w:r>
+      <w:r>
+        <w:rPr>
+          <w:rFonts w:ascii="Garamond" w:hAnsi="Garamond" w:cs="Tahoma"/>
+          <w:sz w:val="24"/>
+          <w:szCs w:val="24"/>
+          <w:lang w:val="en-US"/>
+        </w:rPr>
+        <w:t>results indicate that the cost of nutritional adequacy hinges on two minimum-side constraints in particular: calcium, costly for every household member and on a rising trajectory, and zinc, costly specifically for the adult male and highly variable over time. The heterogeneity in constraint profiles across household members underscores that the cost of nutritional adequacy is not a homogeneous aggregate but the outcome of nutrient-specific tensions that vary with the demographic composition of the household.</w:t>
+      </w:r>
+    </w:p>
+    <w:p>
+      <w:pPr>
+        <w:jc w:val="both"/>
+        <w:rPr>
+          <w:rFonts w:ascii="Garamond" w:hAnsi="Garamond" w:cs="Tahoma"/>
+          <w:sz w:val="28"/>
+          <w:szCs w:val="28"/>
+        </w:rPr>
+      </w:pPr>
     </w:p>
     <w:p>
       <w:pPr>
@@ -2892,6 +3207,7 @@
           <w:b/>
           <w:sz w:val="28"/>
           <w:szCs w:val="28"/>
+          <w:lang w:val="en-US"/>
         </w:rPr>
       </w:pPr>
       <w:r>
@@ -2900,8 +3216,9 @@
           <w:b/>
           <w:sz w:val="28"/>
           <w:szCs w:val="28"/>
-        </w:rPr>
-        <w:t>Costo de patrones de dieta: el premium del CC-</w:t>
+          <w:lang w:val="en-US"/>
+        </w:rPr>
+        <w:t>The Cultural Acceptability Premium: Costs of CC-</w:t>
       </w:r>
       <w:proofErr w:type="spellStart"/>
       <w:r>
@@ -2910,9 +3227,12 @@
           <w:b/>
           <w:sz w:val="28"/>
           <w:szCs w:val="28"/>
+          <w:lang w:val="en-US"/>
         </w:rPr>
         <w:t>CoNA</w:t>
       </w:r>
+      <w:bookmarkStart w:id="1" w:name="_GoBack"/>
+      <w:bookmarkEnd w:id="1"/>
       <w:proofErr w:type="spellEnd"/>
     </w:p>
     <w:p>
@@ -3226,7 +3546,41 @@
           <w:sz w:val="24"/>
           <w:szCs w:val="24"/>
         </w:rPr>
-        <w:t xml:space="preserve"> revela una reordenación estructural en las primas que constituye uno de los hallazgos más relevantes de esta subsección. En 2019, Bogotá presentaba la prima más elevada (1,63%) y Cali la más baja (1,29%), con Medellín en posición intermedia (1,18%) — </w:t>
+        <w:t xml:space="preserve"> revela una reordenación estructural en las primas que constituye uno de los hallazgos más relevantes de esta subsección. En 2019, Bogotá presentaba la prima más elevada (1,63%) y Cali la más baja (1,29%), con Medellín en posición intermedia (1,18%) — una ordenación que se mantuvo durante el episodio inflacionario de 2020, cuando las tres ciudades convergieron hacia primas excepcionalmente altas (3,01%–3,49%) de manera simultánea. A partir de 2021, sin embargo, la ordenación comenzó a invertirse de manera progresiva: Cali superó a Bogotá en prima por primera vez en 2021 (1,57% frente a 1,44%), y esta inversión se consolidó y amplió en los años siguientes. Para 2023 y 2024 Cali se estableció como la ciudad con la prima más alta del sistema (2,19% y 3,65% respectivamente), mientras que Medellín — que en 2022 registró la prima más baja de todo el período (0,85%) — recuperó una posición intermedia.</w:t>
+      </w:r>
+      <w:r>
+        <w:rPr>
+          <w:rFonts w:ascii="Garamond" w:hAnsi="Garamond" w:cs="Tahoma"/>
+          <w:sz w:val="24"/>
+          <w:szCs w:val="24"/>
+        </w:rPr>
+        <w:t xml:space="preserve"> </w:t>
+      </w:r>
+      <w:r>
+        <w:rPr>
+          <w:rFonts w:ascii="Garamond" w:hAnsi="Garamond" w:cs="Tahoma"/>
+          <w:sz w:val="24"/>
+          <w:szCs w:val="24"/>
+        </w:rPr>
+        <w:t xml:space="preserve">Este patrón sugiere que el ajuste </w:t>
+      </w:r>
+      <w:proofErr w:type="spellStart"/>
+      <w:r>
+        <w:rPr>
+          <w:rFonts w:ascii="Garamond" w:hAnsi="Garamond" w:cs="Tahoma"/>
+          <w:sz w:val="24"/>
+          <w:szCs w:val="24"/>
+        </w:rPr>
+        <w:t>post-inflacionario</w:t>
+      </w:r>
+      <w:proofErr w:type="spellEnd"/>
+      <w:r>
+        <w:rPr>
+          <w:rFonts w:ascii="Garamond" w:hAnsi="Garamond" w:cs="Tahoma"/>
+          <w:sz w:val="24"/>
+          <w:szCs w:val="24"/>
+        </w:rPr>
+        <w:t xml:space="preserve"> de 2023–2024 afectó de manera asimétrica la estructura de precios relativos entre los alimentos del patrón de consumo observado y la cesta de mínimo costo en las tres ciudades: en Cali, la brecha entre ambas cestas se amplió de manera sostenida, haciendo progresivamente más costoso diseñar </w:t>
       </w:r>
       <w:r>
         <w:rPr>
@@ -3235,41 +3589,7 @@
           <w:szCs w:val="24"/>
         </w:rPr>
         <w:lastRenderedPageBreak/>
-        <w:t>una ordenación que se mantuvo durante el episodio inflacionario de 2020, cuando las tres ciudades convergieron hacia primas excepcionalmente altas (3,01%–3,49%) de manera simultánea. A partir de 2021, sin embargo, la ordenación comenzó a invertirse de manera progresiva: Cali superó a Bogotá en prima por primera vez en 2021 (1,57% frente a 1,44%), y esta inversión se consolidó y amplió en los años siguientes. Para 2023 y 2024 Cali se estableció como la ciudad con la prima más alta del sistema (2,19% y 3,65% respectivamente), mientras que Medellín — que en 2022 registró la prima más baja de todo el período (0,85%) — recuperó una posición intermedia.</w:t>
-      </w:r>
-      <w:r>
-        <w:rPr>
-          <w:rFonts w:ascii="Garamond" w:hAnsi="Garamond" w:cs="Tahoma"/>
-          <w:sz w:val="24"/>
-          <w:szCs w:val="24"/>
-        </w:rPr>
-        <w:t xml:space="preserve"> </w:t>
-      </w:r>
-      <w:r>
-        <w:rPr>
-          <w:rFonts w:ascii="Garamond" w:hAnsi="Garamond" w:cs="Tahoma"/>
-          <w:sz w:val="24"/>
-          <w:szCs w:val="24"/>
-        </w:rPr>
-        <w:t xml:space="preserve">Este patrón sugiere que el ajuste </w:t>
-      </w:r>
-      <w:proofErr w:type="spellStart"/>
-      <w:r>
-        <w:rPr>
-          <w:rFonts w:ascii="Garamond" w:hAnsi="Garamond" w:cs="Tahoma"/>
-          <w:sz w:val="24"/>
-          <w:szCs w:val="24"/>
-        </w:rPr>
-        <w:t>post-inflacionario</w:t>
-      </w:r>
-      <w:proofErr w:type="spellEnd"/>
-      <w:r>
-        <w:rPr>
-          <w:rFonts w:ascii="Garamond" w:hAnsi="Garamond" w:cs="Tahoma"/>
-          <w:sz w:val="24"/>
-          <w:szCs w:val="24"/>
-        </w:rPr>
-        <w:t xml:space="preserve"> de 2023–2024 afectó de manera asimétrica la estructura de precios relativos entre los alimentos del patrón de consumo observado y la cesta de mínimo costo en las tres ciudades: en Cali, la brecha entre ambas cestas se amplió de manera sostenida, haciendo progresivamente más costoso diseñar intervenciones dietéticas que respeten los hábitos alimentarios locales, mientras que en Medellín dicha brecha se comprimió durante el episodio inflacionario antes de recuperarse parcialmente.</w:t>
+        <w:t>intervenciones dietéticas que respeten los hábitos alimentarios locales, mientras que en Medellín dicha brecha se comprimió durante el episodio inflacionario antes de recuperarse parcialmente.</w:t>
       </w:r>
     </w:p>
     <w:p>
@@ -3524,7 +3844,151 @@
           <w:sz w:val="24"/>
           <w:szCs w:val="24"/>
         </w:rPr>
-        <w:t xml:space="preserve"> </w:t>
+        <w:t xml:space="preserve"> respecto a 2019), lo que significa que casi la mitad del decil de menores ingresos no puede cubrir el umbral calórico mínimo con su presupuesto alimentario efectivo. En Bogotá y Medellín, en cambio, la tasa del primer decil mejoró (−5,5 y −8,0 </w:t>
+      </w:r>
+      <w:proofErr w:type="spellStart"/>
+      <w:r>
+        <w:rPr>
+          <w:rFonts w:ascii="Garamond" w:hAnsi="Garamond" w:cs="Tahoma"/>
+          <w:sz w:val="24"/>
+          <w:szCs w:val="24"/>
+        </w:rPr>
+        <w:t>pp</w:t>
+      </w:r>
+      <w:proofErr w:type="spellEnd"/>
+      <w:r>
+        <w:rPr>
+          <w:rFonts w:ascii="Garamond" w:hAnsi="Garamond" w:cs="Tahoma"/>
+          <w:sz w:val="24"/>
+          <w:szCs w:val="24"/>
+        </w:rPr>
+        <w:t xml:space="preserve"> respectivamente). El pico de </w:t>
+      </w:r>
+      <w:proofErr w:type="spellStart"/>
+      <w:r>
+        <w:rPr>
+          <w:rFonts w:ascii="Garamond" w:hAnsi="Garamond" w:cs="Tahoma"/>
+          <w:sz w:val="24"/>
+          <w:szCs w:val="24"/>
+        </w:rPr>
+        <w:t>inasequibilidad</w:t>
+      </w:r>
+      <w:proofErr w:type="spellEnd"/>
+      <w:r>
+        <w:rPr>
+          <w:rFonts w:ascii="Garamond" w:hAnsi="Garamond" w:cs="Tahoma"/>
+          <w:sz w:val="24"/>
+          <w:szCs w:val="24"/>
+        </w:rPr>
+        <w:t xml:space="preserve"> agregada se registró en 2020 en las tres ciudades — 10,7% en Bogotá, 8,0% en Medellín y 11,9% en Cali — coincidiendo con las disrupciones del presupuesto alimentario asociadas a la pandemia.</w:t>
+      </w:r>
+    </w:p>
+    <w:p>
+      <w:pPr>
+        <w:jc w:val="both"/>
+        <w:rPr>
+          <w:rFonts w:ascii="Garamond" w:hAnsi="Garamond" w:cs="Tahoma"/>
+          <w:sz w:val="24"/>
+          <w:szCs w:val="24"/>
+        </w:rPr>
+      </w:pPr>
+      <w:r>
+        <w:rPr>
+          <w:rFonts w:ascii="Garamond" w:hAnsi="Garamond" w:cs="Tahoma"/>
+          <w:sz w:val="24"/>
+          <w:szCs w:val="24"/>
+        </w:rPr>
+        <w:t xml:space="preserve">La transición de la </w:t>
+      </w:r>
+      <w:proofErr w:type="spellStart"/>
+      <w:r>
+        <w:rPr>
+          <w:rFonts w:ascii="Garamond" w:hAnsi="Garamond" w:cs="Tahoma"/>
+          <w:sz w:val="24"/>
+          <w:szCs w:val="24"/>
+        </w:rPr>
+        <w:t>CoCA</w:t>
+      </w:r>
+      <w:proofErr w:type="spellEnd"/>
+      <w:r>
+        <w:rPr>
+          <w:rFonts w:ascii="Garamond" w:hAnsi="Garamond" w:cs="Tahoma"/>
+          <w:sz w:val="24"/>
+          <w:szCs w:val="24"/>
+        </w:rPr>
+        <w:t xml:space="preserve"> a la </w:t>
+      </w:r>
+      <w:proofErr w:type="spellStart"/>
+      <w:r>
+        <w:rPr>
+          <w:rFonts w:ascii="Garamond" w:hAnsi="Garamond" w:cs="Tahoma"/>
+          <w:sz w:val="24"/>
+          <w:szCs w:val="24"/>
+        </w:rPr>
+        <w:t>CoNA</w:t>
+      </w:r>
+      <w:proofErr w:type="spellEnd"/>
+      <w:r>
+        <w:rPr>
+          <w:rFonts w:ascii="Garamond" w:hAnsi="Garamond" w:cs="Tahoma"/>
+          <w:sz w:val="24"/>
+          <w:szCs w:val="24"/>
+        </w:rPr>
+        <w:t xml:space="preserve"> amplía drásticamente la incidencia. En 2019, el 7,6% de la población de Bogotá, el 9,4% de Medellín y el 10,9% de Cali no podían costear una dieta nutricionalmente adecuada — entre 2,5 y 3 veces más que la </w:t>
+      </w:r>
+      <w:proofErr w:type="spellStart"/>
+      <w:r>
+        <w:rPr>
+          <w:rFonts w:ascii="Garamond" w:hAnsi="Garamond" w:cs="Tahoma"/>
+          <w:sz w:val="24"/>
+          <w:szCs w:val="24"/>
+        </w:rPr>
+        <w:t>inasequibilidad</w:t>
+      </w:r>
+      <w:proofErr w:type="spellEnd"/>
+      <w:r>
+        <w:rPr>
+          <w:rFonts w:ascii="Garamond" w:hAnsi="Garamond" w:cs="Tahoma"/>
+          <w:sz w:val="24"/>
+          <w:szCs w:val="24"/>
+        </w:rPr>
+        <w:t xml:space="preserve"> calórica. La </w:t>
+      </w:r>
+      <w:proofErr w:type="spellStart"/>
+      <w:r>
+        <w:rPr>
+          <w:rFonts w:ascii="Garamond" w:hAnsi="Garamond" w:cs="Tahoma"/>
+          <w:sz w:val="24"/>
+          <w:szCs w:val="24"/>
+        </w:rPr>
+        <w:t>inasequibilidad</w:t>
+      </w:r>
+      <w:proofErr w:type="spellEnd"/>
+      <w:r>
+        <w:rPr>
+          <w:rFonts w:ascii="Garamond" w:hAnsi="Garamond" w:cs="Tahoma"/>
+          <w:sz w:val="24"/>
+          <w:szCs w:val="24"/>
+        </w:rPr>
+        <w:t xml:space="preserve"> de la </w:t>
+      </w:r>
+      <w:proofErr w:type="spellStart"/>
+      <w:r>
+        <w:rPr>
+          <w:rFonts w:ascii="Garamond" w:hAnsi="Garamond" w:cs="Tahoma"/>
+          <w:sz w:val="24"/>
+          <w:szCs w:val="24"/>
+        </w:rPr>
+        <w:t>CoNA</w:t>
+      </w:r>
+      <w:proofErr w:type="spellEnd"/>
+      <w:r>
+        <w:rPr>
+          <w:rFonts w:ascii="Garamond" w:hAnsi="Garamond" w:cs="Tahoma"/>
+          <w:sz w:val="24"/>
+          <w:szCs w:val="24"/>
+        </w:rPr>
+        <w:t xml:space="preserve"> no se limita al primer decil: en Bogotá alcanza hasta el cuarto decil (tasas de 91,9%, 28,5%, 5,6% y 2,4% respectivamente) y en Cali hasta el quinto (99,4%, 67,8%, </w:t>
       </w:r>
       <w:r>
         <w:rPr>
@@ -3533,151 +3997,7 @@
           <w:szCs w:val="24"/>
         </w:rPr>
         <w:lastRenderedPageBreak/>
-        <w:t xml:space="preserve">respecto a 2019), lo que significa que casi la mitad del decil de menores ingresos no puede cubrir el umbral calórico mínimo con su presupuesto alimentario efectivo. En Bogotá y Medellín, en cambio, la tasa del primer decil mejoró (−5,5 y −8,0 </w:t>
-      </w:r>
-      <w:proofErr w:type="spellStart"/>
-      <w:r>
-        <w:rPr>
-          <w:rFonts w:ascii="Garamond" w:hAnsi="Garamond" w:cs="Tahoma"/>
-          <w:sz w:val="24"/>
-          <w:szCs w:val="24"/>
-        </w:rPr>
-        <w:t>pp</w:t>
-      </w:r>
-      <w:proofErr w:type="spellEnd"/>
-      <w:r>
-        <w:rPr>
-          <w:rFonts w:ascii="Garamond" w:hAnsi="Garamond" w:cs="Tahoma"/>
-          <w:sz w:val="24"/>
-          <w:szCs w:val="24"/>
-        </w:rPr>
-        <w:t xml:space="preserve"> respectivamente). El pico de </w:t>
-      </w:r>
-      <w:proofErr w:type="spellStart"/>
-      <w:r>
-        <w:rPr>
-          <w:rFonts w:ascii="Garamond" w:hAnsi="Garamond" w:cs="Tahoma"/>
-          <w:sz w:val="24"/>
-          <w:szCs w:val="24"/>
-        </w:rPr>
-        <w:t>inasequibilidad</w:t>
-      </w:r>
-      <w:proofErr w:type="spellEnd"/>
-      <w:r>
-        <w:rPr>
-          <w:rFonts w:ascii="Garamond" w:hAnsi="Garamond" w:cs="Tahoma"/>
-          <w:sz w:val="24"/>
-          <w:szCs w:val="24"/>
-        </w:rPr>
-        <w:t xml:space="preserve"> agregada se registró en 2020 en las tres ciudades — 10,7% en Bogotá, 8,0% en Medellín y 11,9% en Cali — coincidiendo con las disrupciones del presupuesto alimentario asociadas a la pandemia.</w:t>
-      </w:r>
-    </w:p>
-    <w:p>
-      <w:pPr>
-        <w:jc w:val="both"/>
-        <w:rPr>
-          <w:rFonts w:ascii="Garamond" w:hAnsi="Garamond" w:cs="Tahoma"/>
-          <w:sz w:val="24"/>
-          <w:szCs w:val="24"/>
-        </w:rPr>
-      </w:pPr>
-      <w:r>
-        <w:rPr>
-          <w:rFonts w:ascii="Garamond" w:hAnsi="Garamond" w:cs="Tahoma"/>
-          <w:sz w:val="24"/>
-          <w:szCs w:val="24"/>
-        </w:rPr>
-        <w:t xml:space="preserve">La transición de la </w:t>
-      </w:r>
-      <w:proofErr w:type="spellStart"/>
-      <w:r>
-        <w:rPr>
-          <w:rFonts w:ascii="Garamond" w:hAnsi="Garamond" w:cs="Tahoma"/>
-          <w:sz w:val="24"/>
-          <w:szCs w:val="24"/>
-        </w:rPr>
-        <w:t>CoCA</w:t>
-      </w:r>
-      <w:proofErr w:type="spellEnd"/>
-      <w:r>
-        <w:rPr>
-          <w:rFonts w:ascii="Garamond" w:hAnsi="Garamond" w:cs="Tahoma"/>
-          <w:sz w:val="24"/>
-          <w:szCs w:val="24"/>
-        </w:rPr>
-        <w:t xml:space="preserve"> a la </w:t>
-      </w:r>
-      <w:proofErr w:type="spellStart"/>
-      <w:r>
-        <w:rPr>
-          <w:rFonts w:ascii="Garamond" w:hAnsi="Garamond" w:cs="Tahoma"/>
-          <w:sz w:val="24"/>
-          <w:szCs w:val="24"/>
-        </w:rPr>
-        <w:t>CoNA</w:t>
-      </w:r>
-      <w:proofErr w:type="spellEnd"/>
-      <w:r>
-        <w:rPr>
-          <w:rFonts w:ascii="Garamond" w:hAnsi="Garamond" w:cs="Tahoma"/>
-          <w:sz w:val="24"/>
-          <w:szCs w:val="24"/>
-        </w:rPr>
-        <w:t xml:space="preserve"> amplía drásticamente la incidencia. En 2019, el 7,6% de la población de Bogotá, el 9,4% de Medellín y el 10,9% de Cali no podían costear una dieta nutricionalmente adecuada — entre 2,5 y 3 veces más que la </w:t>
-      </w:r>
-      <w:proofErr w:type="spellStart"/>
-      <w:r>
-        <w:rPr>
-          <w:rFonts w:ascii="Garamond" w:hAnsi="Garamond" w:cs="Tahoma"/>
-          <w:sz w:val="24"/>
-          <w:szCs w:val="24"/>
-        </w:rPr>
-        <w:t>inasequibilidad</w:t>
-      </w:r>
-      <w:proofErr w:type="spellEnd"/>
-      <w:r>
-        <w:rPr>
-          <w:rFonts w:ascii="Garamond" w:hAnsi="Garamond" w:cs="Tahoma"/>
-          <w:sz w:val="24"/>
-          <w:szCs w:val="24"/>
-        </w:rPr>
-        <w:t xml:space="preserve"> calórica. La </w:t>
-      </w:r>
-      <w:proofErr w:type="spellStart"/>
-      <w:r>
-        <w:rPr>
-          <w:rFonts w:ascii="Garamond" w:hAnsi="Garamond" w:cs="Tahoma"/>
-          <w:sz w:val="24"/>
-          <w:szCs w:val="24"/>
-        </w:rPr>
-        <w:t>inasequibilidad</w:t>
-      </w:r>
-      <w:proofErr w:type="spellEnd"/>
-      <w:r>
-        <w:rPr>
-          <w:rFonts w:ascii="Garamond" w:hAnsi="Garamond" w:cs="Tahoma"/>
-          <w:sz w:val="24"/>
-          <w:szCs w:val="24"/>
-        </w:rPr>
-        <w:t xml:space="preserve"> de la </w:t>
-      </w:r>
-      <w:proofErr w:type="spellStart"/>
-      <w:r>
-        <w:rPr>
-          <w:rFonts w:ascii="Garamond" w:hAnsi="Garamond" w:cs="Tahoma"/>
-          <w:sz w:val="24"/>
-          <w:szCs w:val="24"/>
-        </w:rPr>
-        <w:t>CoNA</w:t>
-      </w:r>
-      <w:proofErr w:type="spellEnd"/>
-      <w:r>
-        <w:rPr>
-          <w:rFonts w:ascii="Garamond" w:hAnsi="Garamond" w:cs="Tahoma"/>
-          <w:sz w:val="24"/>
-          <w:szCs w:val="24"/>
-        </w:rPr>
-        <w:t xml:space="preserve"> no se limita al primer decil: en Bogotá alcanza hasta el cuarto decil (tasas de 91,9%, 28,5%, 5,6% y 2,4% respectivamente) y en Cali hasta el quinto (99,4%, 67,8%, 20,2%, 4,9% y 1,0%). La dinámica post-2020 diferencia claramente a las ciudades: mientras Bogotá y Medellín recuperaron parcialmente sus niveles de 2019 (8,3% y 10,6% en 2024), Cali registró en 2023 su peor año fuera de 2020 (23,6%) y en 2024 aún el 20,0% de su población no podía costear la </w:t>
+        <w:t xml:space="preserve">20,2%, 4,9% y 1,0%). La dinámica post-2020 diferencia claramente a las ciudades: mientras Bogotá y Medellín recuperaron parcialmente sus niveles de 2019 (8,3% y 10,6% en 2024), Cali registró en 2023 su peor año fuera de 2020 (23,6%) y en 2024 aún el 20,0% de su población no podía costear la </w:t>
       </w:r>
       <w:proofErr w:type="spellStart"/>
       <w:r>
@@ -3951,7 +4271,145 @@
           <w:sz w:val="24"/>
           <w:szCs w:val="24"/>
         </w:rPr>
-        <w:t xml:space="preserve"> intermedias, el déficit promedio del </w:t>
+        <w:t xml:space="preserve"> intermedias, el déficit promedio del presupuesto alimentario es del 20%–37% del costo de la </w:t>
+      </w:r>
+      <w:proofErr w:type="spellStart"/>
+      <w:r>
+        <w:rPr>
+          <w:rFonts w:ascii="Garamond" w:hAnsi="Garamond" w:cs="Tahoma"/>
+          <w:sz w:val="24"/>
+          <w:szCs w:val="24"/>
+        </w:rPr>
+        <w:t>CoRD</w:t>
+      </w:r>
+      <w:proofErr w:type="spellEnd"/>
+      <w:r>
+        <w:rPr>
+          <w:rFonts w:ascii="Garamond" w:hAnsi="Garamond" w:cs="Tahoma"/>
+          <w:sz w:val="24"/>
+          <w:szCs w:val="24"/>
+        </w:rPr>
+        <w:t xml:space="preserve">. La evolución entre 2019 y 2024 muestra un deterioro generalizado de las brechas en Cali — la brecha del primer decil en la </w:t>
+      </w:r>
+      <w:proofErr w:type="spellStart"/>
+      <w:r>
+        <w:rPr>
+          <w:rFonts w:ascii="Garamond" w:hAnsi="Garamond" w:cs="Tahoma"/>
+          <w:sz w:val="24"/>
+          <w:szCs w:val="24"/>
+        </w:rPr>
+        <w:t>CoRD</w:t>
+      </w:r>
+      <w:proofErr w:type="spellEnd"/>
+      <w:r>
+        <w:rPr>
+          <w:rFonts w:ascii="Garamond" w:hAnsi="Garamond" w:cs="Tahoma"/>
+          <w:sz w:val="24"/>
+          <w:szCs w:val="24"/>
+        </w:rPr>
+        <w:t xml:space="preserve"> pasó de 0,591 a 0,737 —, mientras que en Bogotá y Medellín el deterioro fue más acotado y concentrado en los deciles más bajos. </w:t>
+      </w:r>
+    </w:p>
+    <w:p>
+      <w:pPr>
+        <w:jc w:val="both"/>
+        <w:rPr>
+          <w:rFonts w:ascii="Garamond" w:hAnsi="Garamond" w:cs="Tahoma"/>
+          <w:sz w:val="24"/>
+          <w:szCs w:val="24"/>
+        </w:rPr>
+      </w:pPr>
+      <w:r>
+        <w:rPr>
+          <w:rFonts w:ascii="Garamond" w:hAnsi="Garamond" w:cs="Tahoma"/>
+          <w:sz w:val="24"/>
+          <w:szCs w:val="24"/>
+        </w:rPr>
+        <w:t>[Insertar Tabla 4 aquí]</w:t>
+      </w:r>
+    </w:p>
+    <w:p>
+      <w:pPr>
+        <w:jc w:val="both"/>
+        <w:rPr>
+          <w:rFonts w:ascii="Garamond" w:hAnsi="Garamond" w:cs="Tahoma"/>
+          <w:sz w:val="24"/>
+          <w:szCs w:val="24"/>
+        </w:rPr>
+      </w:pPr>
+      <w:r>
+        <w:rPr>
+          <w:rFonts w:ascii="Garamond" w:hAnsi="Garamond" w:cs="Tahoma"/>
+          <w:sz w:val="24"/>
+          <w:szCs w:val="24"/>
+        </w:rPr>
+        <w:t xml:space="preserve">Los resultados de asequibilidad presentados </w:t>
+      </w:r>
+      <w:r>
+        <w:rPr>
+          <w:rFonts w:ascii="Garamond" w:hAnsi="Garamond" w:cs="Tahoma"/>
+          <w:sz w:val="24"/>
+          <w:szCs w:val="24"/>
+        </w:rPr>
+        <w:t xml:space="preserve">anteriormente </w:t>
+      </w:r>
+      <w:r>
+        <w:rPr>
+          <w:rFonts w:ascii="Garamond" w:hAnsi="Garamond" w:cs="Tahoma"/>
+          <w:sz w:val="24"/>
+          <w:szCs w:val="24"/>
+        </w:rPr>
+        <w:t xml:space="preserve">son sensibles al supuesto sobre la proporción del ingreso que los hogares destinan a alimentación — estimada aquí como una proporción fija por par de deciles a partir de patrones de consumo observados en la </w:t>
+      </w:r>
+      <w:r>
+        <w:rPr>
+          <w:rFonts w:ascii="Garamond" w:hAnsi="Garamond" w:cs="Tahoma"/>
+          <w:sz w:val="24"/>
+          <w:szCs w:val="24"/>
+        </w:rPr>
+        <w:t>ECV</w:t>
+      </w:r>
+      <w:r>
+        <w:rPr>
+          <w:rFonts w:ascii="Garamond" w:hAnsi="Garamond" w:cs="Tahoma"/>
+          <w:sz w:val="24"/>
+          <w:szCs w:val="24"/>
+        </w:rPr>
+        <w:t xml:space="preserve">. Para evaluar la robustez de los hallazgos, se </w:t>
+      </w:r>
+      <w:r>
+        <w:rPr>
+          <w:rFonts w:ascii="Garamond" w:hAnsi="Garamond" w:cs="Tahoma"/>
+          <w:sz w:val="24"/>
+          <w:szCs w:val="24"/>
+        </w:rPr>
+        <w:t>evalúa un escenario</w:t>
+      </w:r>
+      <w:r>
+        <w:rPr>
+          <w:rFonts w:ascii="Garamond" w:hAnsi="Garamond" w:cs="Tahoma"/>
+          <w:sz w:val="24"/>
+          <w:szCs w:val="24"/>
+        </w:rPr>
+        <w:t xml:space="preserve"> extremo en el que los hogares destinan la totalidad de su ingreso per cápita a alimentación (Figura A, Apéndice). Los resultados revelan que la </w:t>
+      </w:r>
+      <w:proofErr w:type="spellStart"/>
+      <w:r>
+        <w:rPr>
+          <w:rFonts w:ascii="Garamond" w:hAnsi="Garamond" w:cs="Tahoma"/>
+          <w:sz w:val="24"/>
+          <w:szCs w:val="24"/>
+        </w:rPr>
+        <w:t>inasequibilidad</w:t>
+      </w:r>
+      <w:proofErr w:type="spellEnd"/>
+      <w:r>
+        <w:rPr>
+          <w:rFonts w:ascii="Garamond" w:hAnsi="Garamond" w:cs="Tahoma"/>
+          <w:sz w:val="24"/>
+          <w:szCs w:val="24"/>
+        </w:rPr>
+        <w:t xml:space="preserve"> en este escenario se concentra exclusivamente en el primer decil. Más </w:t>
       </w:r>
       <w:r>
         <w:rPr>
@@ -3960,145 +4418,7 @@
           <w:szCs w:val="24"/>
         </w:rPr>
         <w:lastRenderedPageBreak/>
-        <w:t xml:space="preserve">presupuesto alimentario es del 20%–37% del costo de la </w:t>
-      </w:r>
-      <w:proofErr w:type="spellStart"/>
-      <w:r>
-        <w:rPr>
-          <w:rFonts w:ascii="Garamond" w:hAnsi="Garamond" w:cs="Tahoma"/>
-          <w:sz w:val="24"/>
-          <w:szCs w:val="24"/>
-        </w:rPr>
-        <w:t>CoRD</w:t>
-      </w:r>
-      <w:proofErr w:type="spellEnd"/>
-      <w:r>
-        <w:rPr>
-          <w:rFonts w:ascii="Garamond" w:hAnsi="Garamond" w:cs="Tahoma"/>
-          <w:sz w:val="24"/>
-          <w:szCs w:val="24"/>
-        </w:rPr>
-        <w:t xml:space="preserve">. La evolución entre 2019 y 2024 muestra un deterioro generalizado de las brechas en Cali — la brecha del primer decil en la </w:t>
-      </w:r>
-      <w:proofErr w:type="spellStart"/>
-      <w:r>
-        <w:rPr>
-          <w:rFonts w:ascii="Garamond" w:hAnsi="Garamond" w:cs="Tahoma"/>
-          <w:sz w:val="24"/>
-          <w:szCs w:val="24"/>
-        </w:rPr>
-        <w:t>CoRD</w:t>
-      </w:r>
-      <w:proofErr w:type="spellEnd"/>
-      <w:r>
-        <w:rPr>
-          <w:rFonts w:ascii="Garamond" w:hAnsi="Garamond" w:cs="Tahoma"/>
-          <w:sz w:val="24"/>
-          <w:szCs w:val="24"/>
-        </w:rPr>
-        <w:t xml:space="preserve"> pasó de 0,591 a 0,737 —, mientras que en Bogotá y Medellín el deterioro fue más acotado y concentrado en los deciles más bajos. </w:t>
-      </w:r>
-    </w:p>
-    <w:p>
-      <w:pPr>
-        <w:jc w:val="both"/>
-        <w:rPr>
-          <w:rFonts w:ascii="Garamond" w:hAnsi="Garamond" w:cs="Tahoma"/>
-          <w:sz w:val="24"/>
-          <w:szCs w:val="24"/>
-        </w:rPr>
-      </w:pPr>
-      <w:r>
-        <w:rPr>
-          <w:rFonts w:ascii="Garamond" w:hAnsi="Garamond" w:cs="Tahoma"/>
-          <w:sz w:val="24"/>
-          <w:szCs w:val="24"/>
-        </w:rPr>
-        <w:t>[Insertar Tabla 4 aquí]</w:t>
-      </w:r>
-    </w:p>
-    <w:p>
-      <w:pPr>
-        <w:jc w:val="both"/>
-        <w:rPr>
-          <w:rFonts w:ascii="Garamond" w:hAnsi="Garamond" w:cs="Tahoma"/>
-          <w:sz w:val="24"/>
-          <w:szCs w:val="24"/>
-        </w:rPr>
-      </w:pPr>
-      <w:r>
-        <w:rPr>
-          <w:rFonts w:ascii="Garamond" w:hAnsi="Garamond" w:cs="Tahoma"/>
-          <w:sz w:val="24"/>
-          <w:szCs w:val="24"/>
-        </w:rPr>
-        <w:t xml:space="preserve">Los resultados de asequibilidad presentados </w:t>
-      </w:r>
-      <w:r>
-        <w:rPr>
-          <w:rFonts w:ascii="Garamond" w:hAnsi="Garamond" w:cs="Tahoma"/>
-          <w:sz w:val="24"/>
-          <w:szCs w:val="24"/>
-        </w:rPr>
-        <w:t xml:space="preserve">anteriormente </w:t>
-      </w:r>
-      <w:r>
-        <w:rPr>
-          <w:rFonts w:ascii="Garamond" w:hAnsi="Garamond" w:cs="Tahoma"/>
-          <w:sz w:val="24"/>
-          <w:szCs w:val="24"/>
-        </w:rPr>
-        <w:t xml:space="preserve">son sensibles al supuesto sobre la proporción del ingreso que los hogares destinan a alimentación — estimada aquí como una proporción fija por par de deciles a partir de patrones de consumo observados en la </w:t>
-      </w:r>
-      <w:r>
-        <w:rPr>
-          <w:rFonts w:ascii="Garamond" w:hAnsi="Garamond" w:cs="Tahoma"/>
-          <w:sz w:val="24"/>
-          <w:szCs w:val="24"/>
-        </w:rPr>
-        <w:t>ECV</w:t>
-      </w:r>
-      <w:r>
-        <w:rPr>
-          <w:rFonts w:ascii="Garamond" w:hAnsi="Garamond" w:cs="Tahoma"/>
-          <w:sz w:val="24"/>
-          <w:szCs w:val="24"/>
-        </w:rPr>
-        <w:t xml:space="preserve">. Para evaluar la robustez de los hallazgos, se </w:t>
-      </w:r>
-      <w:r>
-        <w:rPr>
-          <w:rFonts w:ascii="Garamond" w:hAnsi="Garamond" w:cs="Tahoma"/>
-          <w:sz w:val="24"/>
-          <w:szCs w:val="24"/>
-        </w:rPr>
-        <w:t>evalúa un escenario</w:t>
-      </w:r>
-      <w:r>
-        <w:rPr>
-          <w:rFonts w:ascii="Garamond" w:hAnsi="Garamond" w:cs="Tahoma"/>
-          <w:sz w:val="24"/>
-          <w:szCs w:val="24"/>
-        </w:rPr>
-        <w:t xml:space="preserve"> extremo en el que los hogares destinan la totalidad de su ingreso per cápita a alimentación (Figura A, Apéndice). Los resultados revelan que la </w:t>
-      </w:r>
-      <w:proofErr w:type="spellStart"/>
-      <w:r>
-        <w:rPr>
-          <w:rFonts w:ascii="Garamond" w:hAnsi="Garamond" w:cs="Tahoma"/>
-          <w:sz w:val="24"/>
-          <w:szCs w:val="24"/>
-        </w:rPr>
-        <w:t>inasequibilidad</w:t>
-      </w:r>
-      <w:proofErr w:type="spellEnd"/>
-      <w:r>
-        <w:rPr>
-          <w:rFonts w:ascii="Garamond" w:hAnsi="Garamond" w:cs="Tahoma"/>
-          <w:sz w:val="24"/>
-          <w:szCs w:val="24"/>
-        </w:rPr>
-        <w:t xml:space="preserve"> en este escenario se concentra exclusivamente en el primer decil. Más importante aún, la </w:t>
+        <w:t xml:space="preserve">importante aún, la </w:t>
       </w:r>
       <w:proofErr w:type="spellStart"/>
       <w:r>
@@ -4307,56 +4627,6 @@
       </w:r>
     </w:p>
   </w:footnote>
-  <w:footnote w:id="1">
-    <w:p>
-      <w:pPr>
-        <w:pStyle w:val="Textonotapie"/>
-      </w:pPr>
-      <w:r>
-        <w:rPr>
-          <w:rStyle w:val="Refdenotaalpie"/>
-        </w:rPr>
-        <w:footnoteRef/>
-      </w:r>
-      <w:r>
-        <w:t xml:space="preserve"> </w:t>
-      </w:r>
-      <w:r>
-        <w:rPr>
-          <w:rFonts w:ascii="Garamond" w:hAnsi="Garamond"/>
-        </w:rPr>
-        <w:t xml:space="preserve">Cuando se analiza el cumplimiento de los requerimientos (Figura del apéndice), se excluye el sodio cuya restricción en el modelo </w:t>
-      </w:r>
-      <w:proofErr w:type="spellStart"/>
-      <w:r>
-        <w:rPr>
-          <w:rFonts w:ascii="Garamond" w:hAnsi="Garamond"/>
-        </w:rPr>
-        <w:t>CoNA</w:t>
-      </w:r>
-      <w:proofErr w:type="spellEnd"/>
-      <w:r>
-        <w:rPr>
-          <w:rFonts w:ascii="Garamond" w:hAnsi="Garamond"/>
-        </w:rPr>
-        <w:t xml:space="preserve"> opera como límite máximo y no como mínimo, de modo que los valores de la </w:t>
-      </w:r>
-      <w:proofErr w:type="spellStart"/>
-      <w:r>
-        <w:rPr>
-          <w:rFonts w:ascii="Garamond" w:hAnsi="Garamond"/>
-        </w:rPr>
-        <w:t>CoRD</w:t>
-      </w:r>
-      <w:proofErr w:type="spellEnd"/>
-      <w:r>
-        <w:rPr>
-          <w:rFonts w:ascii="Garamond" w:hAnsi="Garamond"/>
-        </w:rPr>
-        <w:t xml:space="preserve"> por debajo de ese umbral son deseables y no constituyen una deficiencia.</w:t>
-      </w:r>
-    </w:p>
-  </w:footnote>
 </w:footnotes>
 </file>
 
@@ -4959,6 +5229,127 @@
     </w:lvl>
   </w:abstractNum>
   <w:abstractNum w:abstractNumId="4" w15:restartNumberingAfterBreak="0">
+    <w:nsid w:val="43927270"/>
+    <w:multiLevelType w:val="multilevel"/>
+    <w:tmpl w:val="6AB29D6E"/>
+    <w:lvl w:ilvl="0">
+      <w:start w:val="1"/>
+      <w:numFmt w:val="decimal"/>
+      <w:lvlText w:val="%1."/>
+      <w:lvlJc w:val="left"/>
+      <w:pPr>
+        <w:ind w:left="720" w:hanging="360"/>
+      </w:pPr>
+      <w:rPr>
+        <w:rFonts w:hint="default"/>
+      </w:rPr>
+    </w:lvl>
+    <w:lvl w:ilvl="1">
+      <w:start w:val="1"/>
+      <w:numFmt w:val="decimal"/>
+      <w:isLgl/>
+      <w:lvlText w:val="%1.%2."/>
+      <w:lvlJc w:val="left"/>
+      <w:pPr>
+        <w:ind w:left="1080" w:hanging="720"/>
+      </w:pPr>
+      <w:rPr>
+        <w:rFonts w:hint="default"/>
+      </w:rPr>
+    </w:lvl>
+    <w:lvl w:ilvl="2">
+      <w:start w:val="1"/>
+      <w:numFmt w:val="decimal"/>
+      <w:isLgl/>
+      <w:lvlText w:val="%1.%2.%3."/>
+      <w:lvlJc w:val="left"/>
+      <w:pPr>
+        <w:ind w:left="1440" w:hanging="1080"/>
+      </w:pPr>
+      <w:rPr>
+        <w:rFonts w:hint="default"/>
+      </w:rPr>
+    </w:lvl>
+    <w:lvl w:ilvl="3">
+      <w:start w:val="1"/>
+      <w:numFmt w:val="decimal"/>
+      <w:isLgl/>
+      <w:lvlText w:val="%1.%2.%3.%4."/>
+      <w:lvlJc w:val="left"/>
+      <w:pPr>
+        <w:ind w:left="1440" w:hanging="1080"/>
+      </w:pPr>
+      <w:rPr>
+        <w:rFonts w:hint="default"/>
+      </w:rPr>
+    </w:lvl>
+    <w:lvl w:ilvl="4">
+      <w:start w:val="1"/>
+      <w:numFmt w:val="decimal"/>
+      <w:isLgl/>
+      <w:lvlText w:val="%1.%2.%3.%4.%5."/>
+      <w:lvlJc w:val="left"/>
+      <w:pPr>
+        <w:ind w:left="1800" w:hanging="1440"/>
+      </w:pPr>
+      <w:rPr>
+        <w:rFonts w:hint="default"/>
+      </w:rPr>
+    </w:lvl>
+    <w:lvl w:ilvl="5">
+      <w:start w:val="1"/>
+      <w:numFmt w:val="decimal"/>
+      <w:isLgl/>
+      <w:lvlText w:val="%1.%2.%3.%4.%5.%6."/>
+      <w:lvlJc w:val="left"/>
+      <w:pPr>
+        <w:ind w:left="2160" w:hanging="1800"/>
+      </w:pPr>
+      <w:rPr>
+        <w:rFonts w:hint="default"/>
+      </w:rPr>
+    </w:lvl>
+    <w:lvl w:ilvl="6">
+      <w:start w:val="1"/>
+      <w:numFmt w:val="decimal"/>
+      <w:isLgl/>
+      <w:lvlText w:val="%1.%2.%3.%4.%5.%6.%7."/>
+      <w:lvlJc w:val="left"/>
+      <w:pPr>
+        <w:ind w:left="2520" w:hanging="2160"/>
+      </w:pPr>
+      <w:rPr>
+        <w:rFonts w:hint="default"/>
+      </w:rPr>
+    </w:lvl>
+    <w:lvl w:ilvl="7">
+      <w:start w:val="1"/>
+      <w:numFmt w:val="decimal"/>
+      <w:isLgl/>
+      <w:lvlText w:val="%1.%2.%3.%4.%5.%6.%7.%8."/>
+      <w:lvlJc w:val="left"/>
+      <w:pPr>
+        <w:ind w:left="2520" w:hanging="2160"/>
+      </w:pPr>
+      <w:rPr>
+        <w:rFonts w:hint="default"/>
+      </w:rPr>
+    </w:lvl>
+    <w:lvl w:ilvl="8">
+      <w:start w:val="1"/>
+      <w:numFmt w:val="decimal"/>
+      <w:isLgl/>
+      <w:lvlText w:val="%1.%2.%3.%4.%5.%6.%7.%8.%9."/>
+      <w:lvlJc w:val="left"/>
+      <w:pPr>
+        <w:ind w:left="2880" w:hanging="2520"/>
+      </w:pPr>
+      <w:rPr>
+        <w:rFonts w:hint="default"/>
+      </w:rPr>
+    </w:lvl>
+  </w:abstractNum>
+  <w:abstractNum w:abstractNumId="5" w15:restartNumberingAfterBreak="0">
     <w:nsid w:val="4F966737"/>
     <w:multiLevelType w:val="multilevel"/>
     <w:tmpl w:val="CC3A5E66"/>
@@ -5071,7 +5462,7 @@
       </w:pPr>
     </w:lvl>
   </w:abstractNum>
-  <w:abstractNum w:abstractNumId="5" w15:restartNumberingAfterBreak="0">
+  <w:abstractNum w:abstractNumId="6" w15:restartNumberingAfterBreak="0">
     <w:nsid w:val="4F995BE1"/>
     <w:multiLevelType w:val="multilevel"/>
     <w:tmpl w:val="12303E7E"/>
@@ -5220,7 +5611,7 @@
       </w:rPr>
     </w:lvl>
   </w:abstractNum>
-  <w:abstractNum w:abstractNumId="6" w15:restartNumberingAfterBreak="0">
+  <w:abstractNum w:abstractNumId="7" w15:restartNumberingAfterBreak="0">
     <w:nsid w:val="6B2006B2"/>
     <w:multiLevelType w:val="multilevel"/>
     <w:tmpl w:val="6AB29D6E"/>
@@ -5243,7 +5634,7 @@
       <w:lvlText w:val="%1.%2."/>
       <w:lvlJc w:val="left"/>
       <w:pPr>
-        <w:ind w:left="1080" w:hanging="720"/>
+        <w:ind w:left="1004" w:hanging="720"/>
       </w:pPr>
       <w:rPr>
         <w:rFonts w:hint="default"/>
@@ -5341,7 +5732,7 @@
       </w:rPr>
     </w:lvl>
   </w:abstractNum>
-  <w:abstractNum w:abstractNumId="7" w15:restartNumberingAfterBreak="0">
+  <w:abstractNum w:abstractNumId="8" w15:restartNumberingAfterBreak="0">
     <w:nsid w:val="6C62496F"/>
     <w:multiLevelType w:val="multilevel"/>
     <w:tmpl w:val="D4FC45EE"/>
@@ -5490,7 +5881,7 @@
       </w:rPr>
     </w:lvl>
   </w:abstractNum>
-  <w:abstractNum w:abstractNumId="8" w15:restartNumberingAfterBreak="0">
+  <w:abstractNum w:abstractNumId="9" w15:restartNumberingAfterBreak="0">
     <w:nsid w:val="6D4F387E"/>
     <w:multiLevelType w:val="multilevel"/>
     <w:tmpl w:val="D5162E56"/>
@@ -5639,7 +6030,7 @@
       </w:rPr>
     </w:lvl>
   </w:abstractNum>
-  <w:abstractNum w:abstractNumId="9" w15:restartNumberingAfterBreak="0">
+  <w:abstractNum w:abstractNumId="10" w15:restartNumberingAfterBreak="0">
     <w:nsid w:val="72057726"/>
     <w:multiLevelType w:val="multilevel"/>
     <w:tmpl w:val="93CC6928"/>
@@ -5788,7 +6179,7 @@
       </w:rPr>
     </w:lvl>
   </w:abstractNum>
-  <w:abstractNum w:abstractNumId="10" w15:restartNumberingAfterBreak="0">
+  <w:abstractNum w:abstractNumId="11" w15:restartNumberingAfterBreak="0">
     <w:nsid w:val="72CC4B49"/>
     <w:multiLevelType w:val="multilevel"/>
     <w:tmpl w:val="E026C41A"/>
@@ -5937,7 +6328,7 @@
       </w:rPr>
     </w:lvl>
   </w:abstractNum>
-  <w:abstractNum w:abstractNumId="11" w15:restartNumberingAfterBreak="0">
+  <w:abstractNum w:abstractNumId="12" w15:restartNumberingAfterBreak="0">
     <w:nsid w:val="7997742A"/>
     <w:multiLevelType w:val="multilevel"/>
     <w:tmpl w:val="747AE70C"/>
@@ -6087,10 +6478,10 @@
     </w:lvl>
   </w:abstractNum>
   <w:num w:numId="1">
-    <w:abstractNumId w:val="6"/>
+    <w:abstractNumId w:val="7"/>
   </w:num>
   <w:num w:numId="2">
-    <w:abstractNumId w:val="11"/>
+    <w:abstractNumId w:val="12"/>
   </w:num>
   <w:num w:numId="3">
     <w:abstractNumId w:val="2"/>
@@ -6099,27 +6490,30 @@
     <w:abstractNumId w:val="3"/>
   </w:num>
   <w:num w:numId="5">
-    <w:abstractNumId w:val="7"/>
+    <w:abstractNumId w:val="8"/>
   </w:num>
   <w:num w:numId="6">
     <w:abstractNumId w:val="1"/>
   </w:num>
   <w:num w:numId="7">
-    <w:abstractNumId w:val="9"/>
+    <w:abstractNumId w:val="10"/>
   </w:num>
   <w:num w:numId="8">
-    <w:abstractNumId w:val="5"/>
+    <w:abstractNumId w:val="6"/>
   </w:num>
   <w:num w:numId="9">
-    <w:abstractNumId w:val="8"/>
+    <w:abstractNumId w:val="9"/>
   </w:num>
   <w:num w:numId="10">
     <w:abstractNumId w:val="0"/>
   </w:num>
   <w:num w:numId="11">
-    <w:abstractNumId w:val="10"/>
+    <w:abstractNumId w:val="11"/>
   </w:num>
   <w:num w:numId="12">
+    <w:abstractNumId w:val="5"/>
+  </w:num>
+  <w:num w:numId="13">
     <w:abstractNumId w:val="4"/>
   </w:num>
 </w:numbering>
@@ -6636,6 +7030,16 @@
       <w:iCs/>
     </w:rPr>
   </w:style>
+  <w:style w:type="character" w:customStyle="1" w:styleId="katex-mathml">
+    <w:name w:val="katex-mathml"/>
+    <w:basedOn w:val="Fuentedeprrafopredeter"/>
+    <w:rsid w:val="006D6532"/>
+  </w:style>
+  <w:style w:type="character" w:customStyle="1" w:styleId="mord">
+    <w:name w:val="mord"/>
+    <w:basedOn w:val="Fuentedeprrafopredeter"/>
+    <w:rsid w:val="006D6532"/>
+  </w:style>
 </w:styles>
 </file>
 
@@ -6939,7 +7343,7 @@
 </file>
 
 <file path=customXml/itemProps1.xml><?xml version="1.0" encoding="utf-8"?>
-<ds:datastoreItem xmlns:ds="http://schemas.openxmlformats.org/officeDocument/2006/customXml" ds:itemID="{18CB6395-AD83-4B79-A0B8-9A961B9037DE}">
+<ds:datastoreItem xmlns:ds="http://schemas.openxmlformats.org/officeDocument/2006/customXml" ds:itemID="{F7C9DCDD-F029-4510-B11D-CB4FA2E41FA6}">
   <ds:schemaRefs>
     <ds:schemaRef ds:uri="http://schemas.openxmlformats.org/officeDocument/2006/bibliography"/>
   </ds:schemaRefs>

</xml_diff>